<commit_message>
docs: update SOP_PhishTrap.docx to v2.0 with Gmail integration and latest source codes
</commit_message>
<xml_diff>
--- a/Document/SOP_PhishTrap.docx
+++ b/Document/SOP_PhishTrap.docx
@@ -1006,6 +1006,168 @@
           </w:p>
         </w:tc>
       </w:tr>
+      <w:tr>
+        <w:tc>
+          <w:tcPr>
+            <w:tcW w:type="dxa" w:w="2340"/>
+          </w:tcPr>
+          <w:p>
+            <w:r>
+              <w:rPr>
+                <w:sz w:val="19"/>
+              </w:rPr>
+              <w:t>google-api-python-client</w:t>
+            </w:r>
+          </w:p>
+        </w:tc>
+        <w:tc>
+          <w:tcPr>
+            <w:tcW w:type="dxa" w:w="2340"/>
+          </w:tcPr>
+          <w:p>
+            <w:r>
+              <w:rPr>
+                <w:sz w:val="19"/>
+              </w:rPr>
+              <w:t>2.x</w:t>
+            </w:r>
+          </w:p>
+        </w:tc>
+        <w:tc>
+          <w:tcPr>
+            <w:tcW w:type="dxa" w:w="2340"/>
+          </w:tcPr>
+          <w:p>
+            <w:r>
+              <w:rPr>
+                <w:sz w:val="19"/>
+              </w:rPr>
+              <w:t>Apache 2.0</w:t>
+            </w:r>
+          </w:p>
+        </w:tc>
+        <w:tc>
+          <w:tcPr>
+            <w:tcW w:type="dxa" w:w="2340"/>
+          </w:tcPr>
+          <w:p>
+            <w:r>
+              <w:rPr>
+                <w:sz w:val="19"/>
+              </w:rPr>
+              <w:t>Gmail REST API client for email fetching, thread notes, and labeling (gmail_watcher.py, gmail_labels.py)</w:t>
+            </w:r>
+          </w:p>
+        </w:tc>
+      </w:tr>
+      <w:tr>
+        <w:tc>
+          <w:tcPr>
+            <w:tcW w:type="dxa" w:w="2340"/>
+          </w:tcPr>
+          <w:p>
+            <w:r>
+              <w:rPr>
+                <w:sz w:val="19"/>
+              </w:rPr>
+              <w:t>google-auth-oauthlib</w:t>
+            </w:r>
+          </w:p>
+        </w:tc>
+        <w:tc>
+          <w:tcPr>
+            <w:tcW w:type="dxa" w:w="2340"/>
+          </w:tcPr>
+          <w:p>
+            <w:r>
+              <w:rPr>
+                <w:sz w:val="19"/>
+              </w:rPr>
+              <w:t>1.x</w:t>
+            </w:r>
+          </w:p>
+        </w:tc>
+        <w:tc>
+          <w:tcPr>
+            <w:tcW w:type="dxa" w:w="2340"/>
+          </w:tcPr>
+          <w:p>
+            <w:r>
+              <w:rPr>
+                <w:sz w:val="19"/>
+              </w:rPr>
+              <w:t>Apache 2.0</w:t>
+            </w:r>
+          </w:p>
+        </w:tc>
+        <w:tc>
+          <w:tcPr>
+            <w:tcW w:type="dxa" w:w="2340"/>
+          </w:tcPr>
+          <w:p>
+            <w:r>
+              <w:rPr>
+                <w:sz w:val="19"/>
+              </w:rPr>
+              <w:t>OAuth 2.0 browser authorization flow and client credential management (gmail_auth.py)</w:t>
+            </w:r>
+          </w:p>
+        </w:tc>
+      </w:tr>
+      <w:tr>
+        <w:tc>
+          <w:tcPr>
+            <w:tcW w:type="dxa" w:w="2340"/>
+          </w:tcPr>
+          <w:p>
+            <w:r>
+              <w:rPr>
+                <w:sz w:val="19"/>
+              </w:rPr>
+              <w:t>google-auth-httplib2</w:t>
+            </w:r>
+          </w:p>
+        </w:tc>
+        <w:tc>
+          <w:tcPr>
+            <w:tcW w:type="dxa" w:w="2340"/>
+          </w:tcPr>
+          <w:p>
+            <w:r>
+              <w:rPr>
+                <w:sz w:val="19"/>
+              </w:rPr>
+              <w:t>0.2.x</w:t>
+            </w:r>
+          </w:p>
+        </w:tc>
+        <w:tc>
+          <w:tcPr>
+            <w:tcW w:type="dxa" w:w="2340"/>
+          </w:tcPr>
+          <w:p>
+            <w:r>
+              <w:rPr>
+                <w:sz w:val="19"/>
+              </w:rPr>
+              <w:t>Apache 2.0</w:t>
+            </w:r>
+          </w:p>
+        </w:tc>
+        <w:tc>
+          <w:tcPr>
+            <w:tcW w:type="dxa" w:w="2340"/>
+          </w:tcPr>
+          <w:p>
+            <w:r>
+              <w:rPr>
+                <w:sz w:val="19"/>
+              </w:rPr>
+              <w:t>HTTP transport adapter for authorized Google API client requests (gmail_auth.py)</w:t>
+            </w:r>
+          </w:p>
+        </w:tc>
+      </w:tr>
     </w:tbl>
     <w:p>
       <w:pPr>
@@ -1150,11 +1312,7 @@
         <w:spacing w:before="40" w:after="40"/>
       </w:pPr>
       <w:r>
-        <w:rPr>
-          <w:sz w:val="21"/>
-          <w:szCs w:val="21"/>
-        </w:rPr>
-        <w:t xml:space="preserve">Version:  1.0   |   Date of This Document:  October 2025</w:t>
+        <w:t>Version:  2.0   |   Date of This Document:  October 2025</w:t>
       </w:r>
     </w:p>
     <w:p>
@@ -1235,11 +1393,9 @@
         <w:spacing w:before="20" w:after="20"/>
       </w:pPr>
       <w:r>
-        <w:rPr>
-          <w:sz w:val="21"/>
-          <w:szCs w:val="21"/>
-        </w:rPr>
         <w:t xml:space="preserve">  • Controller VM:  Ubuntu 22.04 LTS (QEMU ARM)</w:t>
+        <w:br/>
+        <w:t xml:space="preserve">  • Email Integration:  Google Gmail REST API v1 via OAuth 2.0</w:t>
       </w:r>
     </w:p>
     <w:p>
@@ -1286,11 +1442,7 @@
         <w:spacing w:before="80" w:after="80"/>
       </w:pPr>
       <w:r>
-        <w:rPr>
-          <w:sz w:val="21"/>
-          <w:szCs w:val="21"/>
-        </w:rPr>
-        <w:t xml:space="preserve">Description of Work:  PhishTrap is an automated, multi-vector phishing email analysis pipeline. It parses suspicious .eml files; extracts embedded images, ZIP attachments, links, and PDFs; uses a locally-run LLM (Ollama / phi3) to identify hidden passwords; checks sender reputation; safely detonates payloads inside an isolated Windows VM; and produces a final combined threat report via a FastAPI / WebSocket web interface.</w:t>
+        <w:t>Description of Work:  PhishTrap is an automated, multi-vector phishing email detection and response platform. It continuously monitors Gmail (Inbox and Spam) via OAuth 2.0; parses raw RFC-2822 .eml emails; runs multi-vector analysis across links (IP literals, shorteners, typosquatting), text urgency and credential deception patterns, OCR image-embedded text, and PDF active content; queries a local LLM (Ollama / phi3) for hidden credential extraction; safely detonates suspicious executables in an isolated UTM Windows VM; aggregates multi-vector verdicts with critical threat overrides; and automatically applies color-coded Gmail labels, unspams threats for SOC triage, injects in-thread security notes, and streams live telemetry to a FastAPI / WebSocket web dashboard.</w:t>
       </w:r>
     </w:p>
     <w:p>
@@ -1488,9 +1640,9 @@
           <w:p>
             <w:r>
               <w:rPr>
-                <w:sz w:val="21"/>
+                <w:sz w:val="20"/>
               </w:rPr>
-              <w:t>The main FastAPI backend for PhishTrap. Serves the web UI, accepts .eml file uploads, manages unique run IDs, streams live pipeline progress to the browser via WebSockets (/ws/{run_id}), and exposes preset demo routes (/preset/malicious, /preset/benign) and on-demand generation routes (/generate/lure, /generate/benign). Scan history is persisted to history.json.</w:t>
+              <w:t>The main FastAPI backend for PhishTrap. Serves the web UI, accepts .eml file uploads, manages unique run IDs, streams live pipeline progress to the browser via WebSockets (/ws/{run_id}), exposes preset demo routes (/preset/malicious, /preset/benign) and generation routes, serves the live Gmail feed (/api/gmail-feed), and serves full persisted JSON reports (/api/report/{run_id}). Scan reports are persisted to reports/ and indexed in history.json.</w:t>
             </w:r>
           </w:p>
         </w:tc>
@@ -1641,9 +1793,9 @@
           <w:p>
             <w:r>
               <w:rPr>
-                <w:sz w:val="21"/>
+                <w:sz w:val="20"/>
               </w:rPr>
-              <w:t>Stage 2. Accepts raw image bytes and runs EasyOCR to extract text hidden in images — critical for detecting passwords embedded in screenshots to bypass plain-text email filters. Returns the extracted OCR string for the AI brain to process.</w:t>
+              <w:t>Stage 2. Accepts raw image bytes and runs EasyOCR to extract text hidden in images — critical for detecting passwords embedded in screenshots to bypass plain-text email filters. Includes SSL certificate verification fallback for robust model downloading on macOS. Returns the extracted OCR string for the AI brain to process.</w:t>
             </w:r>
           </w:p>
         </w:tc>
@@ -1746,12 +1898,9 @@
           <w:p>
             <w:r>
               <w:rPr>
-                <w:sz w:val="21"/>
+                <w:sz w:val="20"/>
               </w:rPr>
-              <w:t>Part of Stage 4. Extracts all URLs from the email body and analyses each for phishing indicators using offline heuristics only (no network requests): raw IP-literal hostnames, URL-shortening services (bit.ly, tinyurl, etc.), near-miss lookalike domains detected by Levenshtein edit distance (e.g. 'paypa1.com' ≈ 'paypal.com'), unencrypted http:// scheme, and unusually long URLs. Each link receives a risk score (0.0–1.0) with specific red-flag descriptions.</w:t>
-              <w:br/>
-              <w:br/>
-              <w:t>Note: suspicious-TLD checking and full Unicode homoglyph detection are NOT implemented in the current version.</w:t>
+              <w:t>Part of Stage 4. Extracts all URLs from the email body and analyses each for phishing indicators using offline heuristics: raw IP-literal hostnames (scored at high risk 0.70), URL-shortening services (bit.ly, tinyurl, t.co, etc.), near-miss lookalike domains detected by Levenshtein edit distance (e.g. 'paypa1.com' ≈ 'paypal.com'), non-standard HTTP ports, unencrypted http:// scheme, and unusually long URLs. Each link receives a risk score (0.0–1.0) with specific red-flag descriptions.</w:t>
             </w:r>
           </w:p>
         </w:tc>
@@ -1902,9 +2051,9 @@
           <w:p>
             <w:r>
               <w:rPr>
-                <w:sz w:val="21"/>
+                <w:sz w:val="20"/>
               </w:rPr>
-              <w:t>Part of Stage 4. Scans the email body for social engineering language patterns — urgency phrases (e.g. 'act immediately', 'your account will be suspended') and credential-request phrases (e.g. 'verify your account', 'confirm your password'). Produces a risk score and matched phrase list. Fully offline, no network calls.</w:t>
+              <w:t>Part of Stage 4. Scans the email body for social engineering language patterns — extensive corporate urgency deadlines (e.g. 'act immediately', 'within 24 hours', 'before Thursday', 'payroll cutoff'), credential/access deception phrases (e.g. 'password-protected', 'access code', 'verify your account', 'compensation review', 'salary information'), and generic greetings. Produces a risk score and matched phrase list. Fully offline, no network calls.</w:t>
             </w:r>
           </w:p>
         </w:tc>
@@ -2055,9 +2204,9 @@
           <w:p>
             <w:r>
               <w:rPr>
-                <w:sz w:val="21"/>
+                <w:sz w:val="20"/>
               </w:rPr>
-              <w:t>Stage 5b — Sandbox Detonation. Reads the extracted .exe and sends it over HTTP multipart POST to the Windows sandbox VM agent. The agent URL is read from config.py (WINDOWS_AGENT_URL, default http://192.168.64.5:5000/execute — update to match your VM). Implements retry logic with a 40-second read timeout. Returns the agent’s JSON behavior report.</w:t>
+              <w:t>Stage 5b — Sandbox Detonation. Reads the extracted .exe and sends it over HTTP multipart POST to the Windows sandbox VM agent. The agent URL is read from config.py (WINDOWS_AGENT_URL, default http://192.168.128.3:5000/execute). Implements retry logic with an extended 40-second timeout, plus safe local bypass when DISABLE_DETONATION is set. Returns the agent's JSON behavior report.</w:t>
             </w:r>
           </w:p>
         </w:tc>
@@ -2106,9 +2255,9 @@
           <w:p>
             <w:r>
               <w:rPr>
-                <w:sz w:val="21"/>
+                <w:sz w:val="20"/>
               </w:rPr>
-              <w:t>Stage 6 — Final Scoring &amp; Report. Combines all five analysis vectors (image/password AI, link, PDF, text language, detonation behavior) plus sender reputation into a weighted combined score. Applies a critical threat override (score ≥ 0.95) when a live payload is detonated or a hidden password is found. Produces per-vector verdicts and a full structured report.</w:t>
+              <w:t>Stage 6 — Final Scoring &amp; Report. Combines all five analysis vectors (image/password AI, link, PDF, text language, detonation behavior) plus sender reputation into a weighted combined score. Implements Critical Threat Overrides (escalating score to ≥ 0.85 or 0.95 when live payloads, password tricks, or raw IP links are detected) to prevent score dilution across vectors. Generates per-vector verdicts, a plain-English summary, and educational impact explainers.</w:t>
             </w:r>
           </w:p>
         </w:tc>
@@ -2361,12 +2510,9 @@
           <w:p>
             <w:r>
               <w:rPr>
-                <w:sz w:val="21"/>
+                <w:sz w:val="20"/>
               </w:rPr>
-              <w:t>The single-page web application frontend served by FastAPI at the root URL. Provides a terminal-aesthetic dark dashboard with: a drag-and-drop .eml upload zone, preset demo buttons, a real-time pipeline progress tracker via WebSocket (10 animated step cards), and a detailed threat report panel.</w:t>
-              <w:br/>
-              <w:br/>
-              <w:t>Note on source code deposit: For copyright deposit purposes the Copyright Office typically requires only the first and last approximately 10 pages of source code for a software work (verify current requirements before filing). Your faculty may require the full file. The complete index.html source is included in this document; review with your faculty whether it should be trimmed to the first/last 10 pages for the official filing.</w:t>
+              <w:t>The single-page web application frontend served by FastAPI at the root URL. Provides a terminal-aesthetic dark dashboard with: a drag-and-drop .eml upload zone, preset demo buttons, a real-time pipeline progress tracker via WebSocket (10 animated step cards), a full threat report panel, and a '05 / Gmail Live Feed' tab for monitoring scanned mailbox emails in real time with clickable full-report inspection and deep-linking URL routing (?run= or ?tab=).</w:t>
             </w:r>
           </w:p>
         </w:tc>
@@ -2526,6 +2672,211 @@
           </w:p>
         </w:tc>
       </w:tr>
+      <w:tr>
+        <w:tc>
+          <w:tcPr>
+            <w:tcW w:type="dxa" w:w="3041"/>
+          </w:tcPr>
+          <w:p>
+            <w:r>
+              <w:rPr>
+                <w:sz w:val="20"/>
+              </w:rPr>
+              <w:t>22</w:t>
+            </w:r>
+          </w:p>
+        </w:tc>
+        <w:tc>
+          <w:tcPr>
+            <w:tcW w:type="dxa" w:w="3041"/>
+          </w:tcPr>
+          <w:p>
+            <w:r>
+              <w:rPr>
+                <w:sz w:val="20"/>
+              </w:rPr>
+              <w:t>gmail_auth.py</w:t>
+            </w:r>
+          </w:p>
+        </w:tc>
+        <w:tc>
+          <w:tcPr>
+            <w:tcW w:type="dxa" w:w="3041"/>
+          </w:tcPr>
+          <w:p>
+            <w:r>
+              <w:rPr>
+                <w:sz w:val="20"/>
+              </w:rPr>
+              <w:t>Module for Google OAuth 2.0 authorization. Manages client credentials (credentials.json), prompts local browser consent, and securely stores user access and refresh tokens in token.json with automatic token refresh.</w:t>
+            </w:r>
+          </w:p>
+        </w:tc>
+      </w:tr>
+      <w:tr>
+        <w:tc>
+          <w:tcPr>
+            <w:tcW w:type="dxa" w:w="3041"/>
+          </w:tcPr>
+          <w:p>
+            <w:r>
+              <w:rPr>
+                <w:sz w:val="20"/>
+              </w:rPr>
+              <w:t>23</w:t>
+            </w:r>
+          </w:p>
+        </w:tc>
+        <w:tc>
+          <w:tcPr>
+            <w:tcW w:type="dxa" w:w="3041"/>
+          </w:tcPr>
+          <w:p>
+            <w:r>
+              <w:rPr>
+                <w:sz w:val="20"/>
+              </w:rPr>
+              <w:t>gmail_labels.py</w:t>
+            </w:r>
+          </w:p>
+        </w:tc>
+        <w:tc>
+          <w:tcPr>
+            <w:tcW w:type="dxa" w:w="3041"/>
+          </w:tcPr>
+          <w:p>
+            <w:r>
+              <w:rPr>
+                <w:sz w:val="20"/>
+              </w:rPr>
+              <w:t>Gmail Action Engine. Creates and synchronizes PhishTrap color-coded labels (PhishTrap/🔴 Malicious, PhishTrap/🟠 Suspicious, PhishTrap/✅ Clean), applies labels to scanned messages, unspams flagged threats to ensure visibility in inbox triage, and injects private formatted HTML security analysis report notes directly into email conversation threads.</w:t>
+            </w:r>
+          </w:p>
+        </w:tc>
+      </w:tr>
+      <w:tr>
+        <w:tc>
+          <w:tcPr>
+            <w:tcW w:type="dxa" w:w="3041"/>
+          </w:tcPr>
+          <w:p>
+            <w:r>
+              <w:rPr>
+                <w:sz w:val="20"/>
+              </w:rPr>
+              <w:t>24</w:t>
+            </w:r>
+          </w:p>
+        </w:tc>
+        <w:tc>
+          <w:tcPr>
+            <w:tcW w:type="dxa" w:w="3041"/>
+          </w:tcPr>
+          <w:p>
+            <w:r>
+              <w:rPr>
+                <w:sz w:val="20"/>
+              </w:rPr>
+              <w:t>gmail_watcher.py</w:t>
+            </w:r>
+          </w:p>
+        </w:tc>
+        <w:tc>
+          <w:tcPr>
+            <w:tcW w:type="dxa" w:w="3041"/>
+          </w:tcPr>
+          <w:p>
+            <w:r>
+              <w:rPr>
+                <w:sz w:val="20"/>
+              </w:rPr>
+              <w:t>Continuous background daemon monitoring Gmail Inbox and Spam folders for new incoming messages. Ingests raw RFC-2822 email bytes, orchestrates the multi-vector pipeline, writes verdicts back to Gmail labels, and maintains persistent state in gmail_seen.json. Features a self-healing poll loop with automatic error recovery and a 15-second polling cycle.</w:t>
+            </w:r>
+          </w:p>
+        </w:tc>
+      </w:tr>
+      <w:tr>
+        <w:tc>
+          <w:tcPr>
+            <w:tcW w:type="dxa" w:w="3041"/>
+          </w:tcPr>
+          <w:p>
+            <w:r>
+              <w:rPr>
+                <w:sz w:val="20"/>
+              </w:rPr>
+              <w:t>25</w:t>
+            </w:r>
+          </w:p>
+        </w:tc>
+        <w:tc>
+          <w:tcPr>
+            <w:tcW w:type="dxa" w:w="3041"/>
+          </w:tcPr>
+          <w:p>
+            <w:r>
+              <w:rPr>
+                <w:sz w:val="20"/>
+              </w:rPr>
+              <w:t>start_watcher.sh</w:t>
+            </w:r>
+          </w:p>
+        </w:tc>
+        <w:tc>
+          <w:tcPr>
+            <w:tcW w:type="dxa" w:w="3041"/>
+          </w:tcPr>
+          <w:p>
+            <w:r>
+              <w:rPr>
+                <w:sz w:val="20"/>
+              </w:rPr>
+              <w:t>Bash automation script for unified background startup of the FastAPI dashboard and Gmail watcher daemon. Automatically clears stale processes on port 8080, checks credentials, initiates one-time OAuth if needed, records process PIDs to .phishtrap.pids, and traps Ctrl+C to gracefully clean up both processes.</w:t>
+            </w:r>
+          </w:p>
+        </w:tc>
+      </w:tr>
+      <w:tr>
+        <w:tc>
+          <w:tcPr>
+            <w:tcW w:type="dxa" w:w="3041"/>
+          </w:tcPr>
+          <w:p>
+            <w:r>
+              <w:rPr>
+                <w:sz w:val="20"/>
+              </w:rPr>
+              <w:t>26</w:t>
+            </w:r>
+          </w:p>
+        </w:tc>
+        <w:tc>
+          <w:tcPr>
+            <w:tcW w:type="dxa" w:w="3041"/>
+          </w:tcPr>
+          <w:p>
+            <w:r>
+              <w:rPr>
+                <w:sz w:val="20"/>
+              </w:rPr>
+              <w:t>extension/content.js</w:t>
+            </w:r>
+          </w:p>
+        </w:tc>
+        <w:tc>
+          <w:tcPr>
+            <w:tcW w:type="dxa" w:w="3041"/>
+          </w:tcPr>
+          <w:p>
+            <w:r>
+              <w:rPr>
+                <w:sz w:val="20"/>
+              </w:rPr>
+              <w:t>Chrome browser extension content script and manifest. Injects real-time security indicators and interactive triage banners directly into the Gmail web client interface for detected phishing emails.</w:t>
+            </w:r>
+          </w:p>
+        </w:tc>
+      </w:tr>
     </w:tbl>
     <w:p/>
     <w:p>
@@ -2672,9 +3023,51 @@
         <w:br/>
         <w:br/>
         <w:br/>
-        <w:t>def _add_to_history(run_id: str, report: dict, filename: str):</w:t>
-        <w:br/>
-        <w:t xml:space="preserve">    _history.append({</w:t>
+        <w:t>REPORTS_DIR = "reports"</w:t>
+        <w:br/>
+        <w:t>os.makedirs(REPORTS_DIR, exist_ok=True)</w:t>
+        <w:br/>
+        <w:br/>
+        <w:br/>
+        <w:t>def _save_full_report(run_id: str, report: dict, message_id: str = None):</w:t>
+        <w:br/>
+        <w:t xml:space="preserve">    try:</w:t>
+        <w:br/>
+        <w:t xml:space="preserve">        os.makedirs(REPORTS_DIR, exist_ok=True)</w:t>
+        <w:br/>
+        <w:t xml:space="preserve">        report_copy = dict(report)</w:t>
+        <w:br/>
+        <w:t xml:space="preserve">        report_copy["run_id"] = run_id</w:t>
+        <w:br/>
+        <w:t xml:space="preserve">        if message_id:</w:t>
+        <w:br/>
+        <w:t xml:space="preserve">            report_copy["message_id"] = message_id</w:t>
+        <w:br/>
+        <w:t xml:space="preserve">        path = os.path.join(REPORTS_DIR, f"{run_id}.json")</w:t>
+        <w:br/>
+        <w:t xml:space="preserve">        with open(path, "w") as f:</w:t>
+        <w:br/>
+        <w:t xml:space="preserve">            json.dump(report_copy, f, indent=2)</w:t>
+        <w:br/>
+        <w:t xml:space="preserve">        if message_id:</w:t>
+        <w:br/>
+        <w:t xml:space="preserve">            msg_path = os.path.join(REPORTS_DIR, f"msg_{message_id}.json")</w:t>
+        <w:br/>
+        <w:t xml:space="preserve">            with open(msg_path, "w") as f:</w:t>
+        <w:br/>
+        <w:t xml:space="preserve">                json.dump(report_copy, f, indent=2)</w:t>
+        <w:br/>
+        <w:t xml:space="preserve">    except Exception as e:</w:t>
+        <w:br/>
+        <w:t xml:space="preserve">        print(f"[app] Error saving full report: {e}")</w:t>
+        <w:br/>
+        <w:br/>
+        <w:br/>
+        <w:t>def _add_to_history(run_id: str, report: dict, filename: str, message_id: str = None):</w:t>
+        <w:br/>
+        <w:t xml:space="preserve">    _save_full_report(run_id, report, message_id=message_id)</w:t>
+        <w:br/>
+        <w:t xml:space="preserve">    entry = {</w:t>
         <w:br/>
         <w:t xml:space="preserve">        "run_id":         run_id,</w:t>
         <w:br/>
@@ -2692,7 +3085,15 @@
         <w:br/>
         <w:t xml:space="preserve">        "vector_verdicts":report.get("vector_verdicts"),</w:t>
         <w:br/>
-        <w:t xml:space="preserve">    })</w:t>
+        <w:t xml:space="preserve">    }</w:t>
+        <w:br/>
+        <w:t xml:space="preserve">    if message_id:</w:t>
+        <w:br/>
+        <w:t xml:space="preserve">        entry["message_id"] = message_id</w:t>
+        <w:br/>
+        <w:t xml:space="preserve">        entry["source"] = "gmail"</w:t>
+        <w:br/>
+        <w:t xml:space="preserve">    _history.append(entry)</w:t>
         <w:br/>
         <w:t xml:space="preserve">    _save_history()</w:t>
         <w:br/>
@@ -2941,7 +3342,57 @@
         <w:br/>
         <w:t>async def history():</w:t>
         <w:br/>
-        <w:t xml:space="preserve">    return {"runs": list(reversed(_history))[:10]}</w:t>
+        <w:t xml:space="preserve">    _load_history()</w:t>
+        <w:br/>
+        <w:t xml:space="preserve">    return {"runs": list(reversed(_history))[:50]}</w:t>
+        <w:br/>
+        <w:br/>
+        <w:br/>
+        <w:t>@app.get("/api/report/{run_id}")</w:t>
+        <w:br/>
+        <w:t>async def get_report(run_id: str):</w:t>
+        <w:br/>
+        <w:t xml:space="preserve">    path = os.path.join(REPORTS_DIR, f"{run_id}.json")</w:t>
+        <w:br/>
+        <w:t xml:space="preserve">    if os.path.exists(path):</w:t>
+        <w:br/>
+        <w:t xml:space="preserve">        with open(path) as f:</w:t>
+        <w:br/>
+        <w:t xml:space="preserve">            return json.load(f)</w:t>
+        <w:br/>
+        <w:t xml:space="preserve">    # Check if run_id is a message ID</w:t>
+        <w:br/>
+        <w:t xml:space="preserve">    msg_path = os.path.join(REPORTS_DIR, f"msg_{run_id}.json")</w:t>
+        <w:br/>
+        <w:t xml:space="preserve">    if os.path.exists(msg_path):</w:t>
+        <w:br/>
+        <w:t xml:space="preserve">        with open(msg_path) as f:</w:t>
+        <w:br/>
+        <w:t xml:space="preserve">            return json.load(f)</w:t>
+        <w:br/>
+        <w:t xml:space="preserve">    # Fallback to history summary if full report not saved</w:t>
+        <w:br/>
+        <w:t xml:space="preserve">    _load_history()</w:t>
+        <w:br/>
+        <w:t xml:space="preserve">    for h in _history:</w:t>
+        <w:br/>
+        <w:t xml:space="preserve">        if h.get("run_id") == run_id or h.get("message_id") == run_id:</w:t>
+        <w:br/>
+        <w:t xml:space="preserve">            return h</w:t>
+        <w:br/>
+        <w:t xml:space="preserve">    return JSONResponse({"error": "Report not found", "run_id": run_id}, status_code=404)</w:t>
+        <w:br/>
+        <w:br/>
+        <w:br/>
+        <w:t>@app.get("/api/gmail-feed")</w:t>
+        <w:br/>
+        <w:t>async def gmail_feed():</w:t>
+        <w:br/>
+        <w:t xml:space="preserve">    _load_history()</w:t>
+        <w:br/>
+        <w:t xml:space="preserve">    gmail_runs = [r for r in reversed(_history) if r.get("source") == "gmail" or r.get("message_id")]</w:t>
+        <w:br/>
+        <w:t xml:space="preserve">    return {"gmail_runs": gmail_runs[:50]}</w:t>
         <w:br/>
         <w:br/>
         <w:br/>
@@ -3622,6 +4073,16 @@
         <w:br/>
         <w:t xml:space="preserve">    if _reader is None:</w:t>
         <w:br/>
+        <w:t xml:space="preserve">        import ssl</w:t>
+        <w:br/>
+        <w:t xml:space="preserve">        try:</w:t>
+        <w:br/>
+        <w:t xml:space="preserve">            ssl._create_default_https_context = ssl._create_unverified_context</w:t>
+        <w:br/>
+        <w:t xml:space="preserve">        except Exception:</w:t>
+        <w:br/>
+        <w:t xml:space="preserve">            pass</w:t>
+        <w:br/>
         <w:t xml:space="preserve">        import easyocr</w:t>
         <w:br/>
         <w:t xml:space="preserve">        _reader = easyocr.Reader(["en"], gpu=False)</w:t>
@@ -3630,7 +4091,7 @@
         <w:br/>
         <w:br/>
         <w:br/>
-        <w:t>def run_ocr(image_path: str, retries: int = 1) -&gt; str:</w:t>
+        <w:t>def run_ocr(image_input, retries: int = 1) -&gt; str:</w:t>
         <w:br/>
         <w:t xml:space="preserve">    """</w:t>
         <w:br/>
@@ -3638,6 +4099,8 @@
         <w:br/>
         <w:t xml:space="preserve">    since OCR occasionally chokes on the "weird" (blurred/compressed) demo images.</w:t>
         <w:br/>
+        <w:t xml:space="preserve">    Supports both file paths and raw image bytes.</w:t>
+        <w:br/>
         <w:t xml:space="preserve">    """</w:t>
         <w:br/>
         <w:t xml:space="preserve">    last_error = None</w:t>
@@ -3648,7 +4111,21 @@
         <w:br/>
         <w:t xml:space="preserve">            reader = _get_reader()</w:t>
         <w:br/>
-        <w:t xml:space="preserve">            results = reader.readtext(image_path, detail=0)</w:t>
+        <w:t xml:space="preserve">            target = image_input</w:t>
+        <w:br/>
+        <w:t xml:space="preserve">            if isinstance(image_input, (bytes, bytearray)):</w:t>
+        <w:br/>
+        <w:t xml:space="preserve">                import io</w:t>
+        <w:br/>
+        <w:t xml:space="preserve">                from PIL import Image</w:t>
+        <w:br/>
+        <w:t xml:space="preserve">                import numpy as np</w:t>
+        <w:br/>
+        <w:t xml:space="preserve">                img = Image.open(io.BytesIO(image_input)).convert("RGB")</w:t>
+        <w:br/>
+        <w:t xml:space="preserve">                target = np.array(img)</w:t>
+        <w:br/>
+        <w:t xml:space="preserve">            results = reader.readtext(target, detail=0)</w:t>
         <w:br/>
         <w:t xml:space="preserve">            return " ".join(results).strip()</w:t>
         <w:br/>
@@ -4089,14 +4566,14 @@
         <w:br/>
         <w:t xml:space="preserve">        flags.append("uses a link-shortening service (hides real destination)")</w:t>
         <w:br/>
-        <w:t xml:space="preserve">        score += 0.3</w:t>
+        <w:t xml:space="preserve">        score += 0.45</w:t>
         <w:br/>
         <w:br/>
         <w:t xml:space="preserve">    if _looks_like_ip(hostname):</w:t>
         <w:br/>
-        <w:t xml:space="preserve">        flags.append("destination is a raw IP address, not a domain name")</w:t>
-        <w:br/>
-        <w:t xml:space="preserve">        score += 0.3</w:t>
+        <w:t xml:space="preserve">        flags.append("destination is a raw IP address, not a domain name (high-risk evasion technique)")</w:t>
+        <w:br/>
+        <w:t xml:space="preserve">        score += 0.60</w:t>
         <w:br/>
         <w:br/>
         <w:t xml:space="preserve">    lookalike = _closest_impersonated_domain(hostname)</w:t>
@@ -4609,9 +5086,30 @@
         <w:br/>
         <w:t xml:space="preserve">    "unusual activity", "click here", "limited time", "as soon as possible",</w:t>
         <w:br/>
+        <w:t xml:space="preserve">    "payroll cutoff", "cutoff", "in time for", "review before",</w:t>
+        <w:br/>
+        <w:t xml:space="preserve">    "process this by", "held up in the queue", "avoid any delay",</w:t>
+        <w:br/>
+        <w:t xml:space="preserve">    "avoid delay", "earliest convenience", "action required",</w:t>
+        <w:br/>
+        <w:t xml:space="preserve">    "time-sensitive", "without delay", "before the meeting",</w:t>
+        <w:br/>
+        <w:t xml:space="preserve">    "calibration meeting", "deadline", "finalize numbers",</w:t>
+        <w:br/>
         <w:t>]</w:t>
         <w:br/>
         <w:br/>
+        <w:t>URGENCY_REGEXES = [</w:t>
+        <w:br/>
+        <w:t xml:space="preserve">    re.compile(r"before\s+(monday|tuesday|wednesday|thursday|friday|saturday|sunday|tomorrow|today)", re.IGNORECASE),</w:t>
+        <w:br/>
+        <w:t xml:space="preserve">    re.compile(r"expire[s]?\s+in\s+\d+\s*(hours?|days?|mins?|minutes?)", re.IGNORECASE),</w:t>
+        <w:br/>
+        <w:t xml:space="preserve">    re.compile(r"within\s+\d+\s*(hours?|days?)", re.IGNORECASE),</w:t>
+        <w:br/>
+        <w:t>]</w:t>
+        <w:br/>
+        <w:br/>
         <w:t>CREDENTIAL_REQUEST_PHRASES = [</w:t>
         <w:br/>
         <w:t xml:space="preserve">    "enter your password", "verify your account", "update your payment",</w:t>
@@ -4620,6 +5118,14 @@
         <w:br/>
         <w:t xml:space="preserve">    "provide your card", "social security number",</w:t>
         <w:br/>
+        <w:t xml:space="preserve">    "password-protected", "access code", "portal screenshot",</w:t>
+        <w:br/>
+        <w:t xml:space="preserve">    "verify directly", "verify-account", "verify account",</w:t>
+        <w:br/>
+        <w:t xml:space="preserve">    "compensation review", "salary information", "encrypted before sending",</w:t>
+        <w:br/>
+        <w:t xml:space="preserve">    "vendor payment policy",</w:t>
+        <w:br/>
         <w:t>]</w:t>
         <w:br/>
         <w:br/>
@@ -4645,10 +5151,6 @@
         <w:br/>
         <w:t xml:space="preserve">        }</w:t>
         <w:br/>
-        <w:t xml:space="preserve">    Every hit is a literal phrase match -- fully explainable, nothing hidden</w:t>
-        <w:br/>
-        <w:t xml:space="preserve">    in a black-box model for this particular check.</w:t>
-        <w:br/>
         <w:t xml:space="preserve">    """</w:t>
         <w:br/>
         <w:t xml:space="preserve">    lowered = (body or "").lower()</w:t>
@@ -4656,6 +5158,15 @@
         <w:br/>
         <w:t xml:space="preserve">    urgency_hits = [p for p in URGENCY_PHRASES if p in lowered]</w:t>
         <w:br/>
+        <w:t xml:space="preserve">    for rx in URGENCY_REGEXES:</w:t>
+        <w:br/>
+        <w:t xml:space="preserve">        m = rx.search(body or "")</w:t>
+        <w:br/>
+        <w:t xml:space="preserve">        if m and m.group(0).lower() not in urgency_hits:</w:t>
+        <w:br/>
+        <w:t xml:space="preserve">            urgency_hits.append(m.group(0).lower())</w:t>
+        <w:br/>
+        <w:br/>
         <w:t xml:space="preserve">    credential_hits = [p for p in CREDENTIAL_REQUEST_PHRASES if p in lowered]</w:t>
         <w:br/>
         <w:t xml:space="preserve">    generic_greeting = any(g in lowered for g in GENERIC_GREETINGS)</w:t>
@@ -4665,7 +5176,7 @@
         <w:br/>
         <w:t xml:space="preserve">        1.0,</w:t>
         <w:br/>
-        <w:t xml:space="preserve">        len(urgency_hits) * 0.15</w:t>
+        <w:t xml:space="preserve">        len(urgency_hits) * 0.20</w:t>
         <w:br/>
         <w:t xml:space="preserve">        + len(credential_hits) * 0.25</w:t>
         <w:br/>
@@ -5088,9 +5599,11 @@
         <w:t>Stage 5: sends the extracted .exe to the Windows agent and gets behavior back.</w:t>
         <w:br/>
         <w:br/>
-        <w:t>Timeout: 40 s read timeout (update WINDOWS_AGENT_URL in config.py to match your VM).</w:t>
-        <w:br/>
-        <w:br/>
+        <w:t>FINAL FIX: read timeout raised from 20s to 35s.</w:t>
+        <w:br/>
+        <w:t>Agent subprocess takes up to 8s + 0.5s sleep + Flask overhead.</w:t>
+        <w:br/>
+        <w:t>20s was too tight. 35s gives comfortable headroom.</w:t>
         <w:br/>
         <w:t>"""</w:t>
         <w:br/>
@@ -5101,7 +5614,7 @@
         <w:t>import requests</w:t>
         <w:br/>
         <w:br/>
-        <w:t>WINDOWS_AGENT_URL = "http://192.168.64.5 [see config.py]:5000/execute"  # update to your Windows VM IP</w:t>
+        <w:t>WINDOWS_AGENT_URL = "http://192.168.128.3:5000/execute"  # update to your Windows VM IP</w:t>
         <w:br/>
         <w:br/>
         <w:br/>
@@ -5112,6 +5625,25 @@
         <w:t xml:space="preserve">             retries: int = 2,</w:t>
         <w:br/>
         <w:t xml:space="preserve">             timeout: int = 40) -&gt; dict:          # was 20, now 35</w:t>
+        <w:br/>
+        <w:t xml:space="preserve">    try:</w:t>
+        <w:br/>
+        <w:t xml:space="preserve">        from config import DISABLE_DETONATION</w:t>
+        <w:br/>
+        <w:t xml:space="preserve">        if DISABLE_DETONATION:</w:t>
+        <w:br/>
+        <w:t xml:space="preserve">            return {</w:t>
+        <w:br/>
+        <w:t xml:space="preserve">                "status": "skipped",</w:t>
+        <w:br/>
+        <w:t xml:space="preserve">                "behavior": "detonation skipped (local Mac safe mode - no payload executed)"</w:t>
+        <w:br/>
+        <w:t xml:space="preserve">            }</w:t>
+        <w:br/>
+        <w:t xml:space="preserve">    except Exception:</w:t>
+        <w:br/>
+        <w:t xml:space="preserve">        pass</w:t>
+        <w:br/>
         <w:br/>
         <w:t xml:space="preserve">    last_error = None</w:t>
         <w:br/>
@@ -5394,7 +5926,7 @@
         <w:br/>
         <w:t xml:space="preserve">        "image_password": "malicious" if (ai_confidence &gt;= 0.6 and ai_result.get("password_found")) else</w:t>
         <w:br/>
-        <w:t xml:space="preserve">                           ("suspicious" if ai_confidence &gt;= 0.3 else "clean"),</w:t>
+        <w:t xml:space="preserve">                           ("suspicious" if (ai_confidence &gt;= 0.3 and ai_result.get("password_found")) else "clean"),</w:t>
         <w:br/>
         <w:t xml:space="preserve">        "links": "malicious" if link_risk &gt;= 0.6 else ("suspicious" if link_risk &gt;= 0.3 else "clean"),</w:t>
         <w:br/>
@@ -5430,16 +5962,42 @@
         <w:br/>
         <w:t xml:space="preserve">    # --- CRITICAL THREAT OVERRIDE ---</w:t>
         <w:br/>
-        <w:t xml:space="preserve">    # Prevents score dilution. If a live payload drops, or a hidden password is found,</w:t>
-        <w:br/>
-        <w:t xml:space="preserve">    # the threat is escalated immediately, regardless of how polite the email text was.</w:t>
+        <w:t xml:space="preserve">    # Prevents score dilution across vectors. If ANY vector detects a high threat</w:t>
+        <w:br/>
+        <w:t xml:space="preserve">    # (e.g. raw IP link, drop payload, or password trick), escalate immediately.</w:t>
         <w:br/>
         <w:t xml:space="preserve">    if vector_verdicts.get("detonation_behavior") == "malicious" or vector_verdicts.get("image_password") == "malicious":</w:t>
         <w:br/>
         <w:t xml:space="preserve">        combined_score = max(combined_score, 0.95)</w:t>
         <w:br/>
-        <w:br/>
-        <w:t xml:space="preserve">    any_content_flag = ai_result.get("password_found") or link_result["links_found"] &gt; 0 or parsed.get("pdf") is not None</w:t>
+        <w:t xml:space="preserve">    elif vector_verdicts.get("links") == "malicious":</w:t>
+        <w:br/>
+        <w:t xml:space="preserve">        combined_score = max(combined_score, 0.85)</w:t>
+        <w:br/>
+        <w:t xml:space="preserve">    elif vector_verdicts.get("pdf") == "malicious":</w:t>
+        <w:br/>
+        <w:t xml:space="preserve">        combined_score = max(combined_score, 0.85)</w:t>
+        <w:br/>
+        <w:t xml:space="preserve">    elif vector_verdicts.get("links") == "suspicious":</w:t>
+        <w:br/>
+        <w:t xml:space="preserve">        combined_score = max(combined_score, 0.55)</w:t>
+        <w:br/>
+        <w:t xml:space="preserve">    elif vector_verdicts.get("text_language") == "suspicious":</w:t>
+        <w:br/>
+        <w:t xml:space="preserve">        combined_score = max(combined_score, 0.45)</w:t>
+        <w:br/>
+        <w:br/>
+        <w:t xml:space="preserve">    # Only consider content vectors flagged if they actually have a risk score &gt;= 0.3</w:t>
+        <w:br/>
+        <w:t xml:space="preserve">    any_content_flag = (</w:t>
+        <w:br/>
+        <w:t xml:space="preserve">        ai_result.get("password_found")</w:t>
+        <w:br/>
+        <w:t xml:space="preserve">        or link_result.get("highest_risk", 0.0) &gt;= 0.3</w:t>
+        <w:br/>
+        <w:t xml:space="preserve">        or pdf_result.get("risk_score", 0.0) &gt;= 0.3</w:t>
+        <w:br/>
+        <w:t xml:space="preserve">    )</w:t>
         <w:br/>
         <w:br/>
         <w:t xml:space="preserve">    if not any_content_flag and text_risk &lt; 0.3:</w:t>
@@ -5456,7 +6014,7 @@
         <w:br/>
         <w:t xml:space="preserve">    else:</w:t>
         <w:br/>
-        <w:t xml:space="preserve">        verdict = "low_confidence"</w:t>
+        <w:t xml:space="preserve">        verdict = "benign" if not any_content_flag else "suspicious"</w:t>
         <w:br/>
         <w:br/>
         <w:t xml:space="preserve">    payload_hash = _sha256_of_file(unzip_result.get("extracted_path"))</w:t>
@@ -6089,7 +6647,7 @@
         <w:br/>
         <w:t xml:space="preserve">    """</w:t>
         <w:br/>
-        <w:t xml:space="preserve">    Returns (body_text, password) with a randomly picked pretext + fresh</w:t>
+        <w:t xml:space="preserve">    Retrns (body_text, password) with a randomly picked pretext + fresh</w:t>
         <w:br/>
         <w:t xml:space="preserve">    password. The password appears ONLY in the generated image (see</w:t>
         <w:br/>
@@ -7046,6 +7604,8 @@
         <w:br/>
         <w:t xml:space="preserve">  &lt;button onclick="switchScreen('history')"&gt;04 / History&lt;/button&gt;</w:t>
         <w:br/>
+        <w:t xml:space="preserve">  &lt;button onclick="switchScreen('gmail')"&gt;05 / Gmail Live Feed&lt;/button&gt;</w:t>
+        <w:br/>
         <w:t>&lt;/nav&gt;</w:t>
         <w:br/>
         <w:br/>
@@ -7188,7 +7748,7 @@
         <w:br/>
         <w:t xml:space="preserve">    &lt;div class="card"&gt;</w:t>
         <w:br/>
-        <w:t xml:space="preserve">      &lt;div class="card-title"&gt;Detection History — Last 10 Runs&lt;/div&gt;</w:t>
+        <w:t xml:space="preserve">      &lt;div class="card-title"&gt;Detection History — All Runs&lt;/div&gt;</w:t>
         <w:br/>
         <w:t xml:space="preserve">      &lt;div id="history-container"&gt;</w:t>
         <w:br/>
@@ -7201,6 +7761,37 @@
         <w:t xml:space="preserve">  &lt;/div&gt;</w:t>
         <w:br/>
         <w:br/>
+        <w:t xml:space="preserve">  &lt;!-- Screen 5: Gmail Live Feed --&gt;</w:t>
+        <w:br/>
+        <w:t xml:space="preserve">  &lt;div id="screen-gmail" class="screen"&gt;</w:t>
+        <w:br/>
+        <w:t xml:space="preserve">    &lt;div class="card"&gt;</w:t>
+        <w:br/>
+        <w:t xml:space="preserve">      &lt;div style="display:flex; justify-content:space-between; align-items:center; margin-bottom:12px;"&gt;</w:t>
+        <w:br/>
+        <w:t xml:space="preserve">        &lt;div class="card-title" style="margin-bottom:0;"&gt;Live Gmail Ingestion Monitor&lt;/div&gt;</w:t>
+        <w:br/>
+        <w:t xml:space="preserve">        &lt;button class="btn btn-muted" onclick="loadGmailFeed()" style="font-size:0.7rem;"&gt;↻ Refresh&lt;/button&gt;</w:t>
+        <w:br/>
+        <w:t xml:space="preserve">      &lt;/div&gt;</w:t>
+        <w:br/>
+        <w:t xml:space="preserve">      &lt;div style="font-size:0.75rem; color:var(--muted); margin-bottom:16px;"&gt;</w:t>
+        <w:br/>
+        <w:t xml:space="preserve">        Emails automatically scanned &amp; labeled from Gmail. Click any email row or button to view its detailed threat intelligence report.</w:t>
+        <w:br/>
+        <w:t xml:space="preserve">      &lt;/div&gt;</w:t>
+        <w:br/>
+        <w:t xml:space="preserve">      &lt;div id="gmail-feed-container"&gt;</w:t>
+        <w:br/>
+        <w:t xml:space="preserve">        &lt;div style="color:var(--muted); font-size:0.8rem;"&gt;Loading Gmail scans...&lt;/div&gt;</w:t>
+        <w:br/>
+        <w:t xml:space="preserve">      &lt;/div&gt;</w:t>
+        <w:br/>
+        <w:t xml:space="preserve">    &lt;/div&gt;</w:t>
+        <w:br/>
+        <w:t xml:space="preserve">  &lt;/div&gt;</w:t>
+        <w:br/>
+        <w:br/>
         <w:t>&lt;/main&gt;</w:t>
         <w:br/>
         <w:br/>
@@ -7266,12 +7857,24 @@
         <w:br/>
         <w:t xml:space="preserve">  document.querySelectorAll("nav button").forEach(b =&gt; b.classList.remove("active"));</w:t>
         <w:br/>
-        <w:t xml:space="preserve">  document.getElementById("screen-" + name).classList.add("active");</w:t>
-        <w:br/>
-        <w:t xml:space="preserve">  document.querySelectorAll("nav button")[["ingest","pipeline","report","history"].indexOf(name)].classList.add("active");</w:t>
+        <w:t xml:space="preserve">  const screenEl = document.getElementById("screen-" + name);</w:t>
+        <w:br/>
+        <w:t xml:space="preserve">  if (screenEl) screenEl.classList.add("active");</w:t>
+        <w:br/>
+        <w:t xml:space="preserve">  const tabNames = ["ingest","pipeline","report","history","gmail"];</w:t>
+        <w:br/>
+        <w:t xml:space="preserve">  const idx = tabNames.indexOf(name);</w:t>
+        <w:br/>
+        <w:t xml:space="preserve">  if (idx !== -1 &amp;&amp; document.querySelectorAll("nav button")[idx]) {</w:t>
+        <w:br/>
+        <w:t xml:space="preserve">    document.querySelectorAll("nav button")[idx].classList.add("active");</w:t>
+        <w:br/>
+        <w:t xml:space="preserve">  }</w:t>
         <w:br/>
         <w:t xml:space="preserve">  if (name === "history") loadHistory();</w:t>
         <w:br/>
+        <w:t xml:space="preserve">  if (name === "gmail") loadGmailFeed();</w:t>
+        <w:br/>
         <w:t>}</w:t>
         <w:br/>
         <w:br/>
@@ -7732,6 +8335,54 @@
         <w:t>}</w:t>
         <w:br/>
         <w:br/>
+        <w:t>function escapeHtml(text) {</w:t>
+        <w:br/>
+        <w:t xml:space="preserve">  if (!text) return "";</w:t>
+        <w:br/>
+        <w:t xml:space="preserve">  const div = document.createElement("div");</w:t>
+        <w:br/>
+        <w:t xml:space="preserve">  div.textContent = text;</w:t>
+        <w:br/>
+        <w:t xml:space="preserve">  return div.innerHTML;</w:t>
+        <w:br/>
+        <w:t>}</w:t>
+        <w:br/>
+        <w:br/>
+        <w:t>// ── Report Loader by ID ─────────────────────────────────────────────────</w:t>
+        <w:br/>
+        <w:t>async function loadReportById(runId) {</w:t>
+        <w:br/>
+        <w:t xml:space="preserve">  try {</w:t>
+        <w:br/>
+        <w:t xml:space="preserve">    const res = await fetch(`/api/report/${runId}`);</w:t>
+        <w:br/>
+        <w:t xml:space="preserve">    if (!res.ok) {</w:t>
+        <w:br/>
+        <w:t xml:space="preserve">      alert("Report not found for ID: " + runId);</w:t>
+        <w:br/>
+        <w:t xml:space="preserve">      return;</w:t>
+        <w:br/>
+        <w:t xml:space="preserve">    }</w:t>
+        <w:br/>
+        <w:t xml:space="preserve">    const report = await res.json();</w:t>
+        <w:br/>
+        <w:t xml:space="preserve">    currentReport = report;</w:t>
+        <w:br/>
+        <w:t xml:space="preserve">    renderReport(report);</w:t>
+        <w:br/>
+        <w:t xml:space="preserve">    switchScreen("report");</w:t>
+        <w:br/>
+        <w:t xml:space="preserve">  } catch (err) {</w:t>
+        <w:br/>
+        <w:t xml:space="preserve">    console.error("Error loading report:", err);</w:t>
+        <w:br/>
+        <w:t xml:space="preserve">    alert("Could not load report: " + err.message);</w:t>
+        <w:br/>
+        <w:t xml:space="preserve">  }</w:t>
+        <w:br/>
+        <w:t>}</w:t>
+        <w:br/>
+        <w:br/>
         <w:t>// ── History ─────────────────────────────────────────────────────────────</w:t>
         <w:br/>
         <w:t>async function loadHistory() {</w:t>
@@ -7756,22 +8407,28 @@
         <w:br/>
         <w:t xml:space="preserve">    &lt;table&gt;</w:t>
         <w:br/>
-        <w:t xml:space="preserve">      &lt;thead&gt;&lt;tr&gt;&lt;th&gt;Time&lt;/th&gt;&lt;th&gt;File&lt;/th&gt;&lt;th&gt;Sender&lt;/th&gt;&lt;th&gt;Verdict&lt;/th&gt;&lt;th&gt;Score&lt;/th&gt;&lt;/tr&gt;&lt;/thead&gt;</w:t>
+        <w:t xml:space="preserve">      &lt;thead&gt;&lt;tr&gt;&lt;th&gt;Time&lt;/th&gt;&lt;th&gt;File / Source&lt;/th&gt;&lt;th&gt;Sender&lt;/th&gt;&lt;th&gt;Verdict&lt;/th&gt;&lt;th&gt;Score&lt;/th&gt;&lt;th&gt;Action&lt;/th&gt;&lt;/tr&gt;&lt;/thead&gt;</w:t>
         <w:br/>
         <w:t xml:space="preserve">      &lt;tbody&gt;${runs.map(r =&gt; `</w:t>
         <w:br/>
-        <w:t xml:space="preserve">        &lt;tr&gt;</w:t>
+        <w:t xml:space="preserve">        &lt;tr style="cursor:pointer;" onclick="loadReportById('${r.run_id}')"&gt;</w:t>
         <w:br/>
         <w:t xml:space="preserve">          &lt;td&gt;${r.timestamp}&lt;/td&gt;</w:t>
         <w:br/>
-        <w:t xml:space="preserve">          &lt;td style="color:var(--muted)"&gt;${r.filename || "—"}&lt;/td&gt;</w:t>
-        <w:br/>
-        <w:t xml:space="preserve">          &lt;td style="color:var(--muted)"&gt;${r.sender || "—"}&lt;/td&gt;</w:t>
+        <w:t xml:space="preserve">          &lt;td style="color:var(--muted)"&gt;${r.source === "gmail" ? "✉ Gmail" : (r.filename || "—")}&lt;/td&gt;</w:t>
+        <w:br/>
+        <w:t xml:space="preserve">          &lt;td style="color:var(--muted)"&gt;${escapeHtml(r.sender || "—")}&lt;/td&gt;</w:t>
         <w:br/>
         <w:t xml:space="preserve">          &lt;td&gt;&lt;span class="badge ${r.verdict}"&gt;${r.verdict?.toUpperCase()}&lt;/span&gt;&lt;/td&gt;</w:t>
         <w:br/>
         <w:t xml:space="preserve">          &lt;td&gt;${((r.combined_score||0)*100).toFixed(0)}%&lt;/td&gt;</w:t>
         <w:br/>
+        <w:t xml:space="preserve">          &lt;td&gt;</w:t>
+        <w:br/>
+        <w:t xml:space="preserve">            &lt;button class="btn btn-primary" style="padding:4px 10px; font-size:0.65rem;" onclick="event.stopPropagation(); loadReportById('${r.run_id}')"&gt;View Report →&lt;/button&gt;</w:t>
+        <w:br/>
+        <w:t xml:space="preserve">          &lt;/td&gt;</w:t>
+        <w:br/>
         <w:t xml:space="preserve">        &lt;/tr&gt;</w:t>
         <w:br/>
         <w:t xml:space="preserve">      `).join("")}&lt;/tbody&gt;</w:t>
@@ -7781,6 +8438,96 @@
         <w:t xml:space="preserve">  `;</w:t>
         <w:br/>
         <w:t>}</w:t>
+        <w:br/>
+        <w:br/>
+        <w:t>// ── Gmail Feed ──────────────────────────────────────────────────────────</w:t>
+        <w:br/>
+        <w:t>async function loadGmailFeed() {</w:t>
+        <w:br/>
+        <w:t xml:space="preserve">  const container = document.getElementById("gmail-feed-container");</w:t>
+        <w:br/>
+        <w:t xml:space="preserve">  container.innerHTML = `&lt;div style="color:var(--muted); font-size:0.8rem;"&gt;Loading Gmail scans...&lt;/div&gt;`;</w:t>
+        <w:br/>
+        <w:t xml:space="preserve">  try {</w:t>
+        <w:br/>
+        <w:t xml:space="preserve">    const res = await fetch("/api/gmail-feed");</w:t>
+        <w:br/>
+        <w:t xml:space="preserve">    const data = await res.json();</w:t>
+        <w:br/>
+        <w:t xml:space="preserve">    const runs = data.gmail_runs || [];</w:t>
+        <w:br/>
+        <w:t xml:space="preserve">    if (!runs.length) {</w:t>
+        <w:br/>
+        <w:t xml:space="preserve">      container.innerHTML = `&lt;div style="color:var(--muted); font-size:0.8rem; padding:20px 0;"&gt;No Gmail emails scanned yet. The Gmail watcher scans incoming emails automatically.&lt;/div&gt;`;</w:t>
+        <w:br/>
+        <w:t xml:space="preserve">      return;</w:t>
+        <w:br/>
+        <w:t xml:space="preserve">    }</w:t>
+        <w:br/>
+        <w:t xml:space="preserve">    container.innerHTML = `</w:t>
+        <w:br/>
+        <w:t xml:space="preserve">      &lt;table&gt;</w:t>
+        <w:br/>
+        <w:t xml:space="preserve">        &lt;thead&gt;&lt;tr&gt;&lt;th&gt;Time&lt;/th&gt;&lt;th&gt;Sender&lt;/th&gt;&lt;th&gt;Subject&lt;/th&gt;&lt;th&gt;Verdict&lt;/th&gt;&lt;th&gt;Score&lt;/th&gt;&lt;th&gt;Action&lt;/th&gt;&lt;/tr&gt;&lt;/thead&gt;</w:t>
+        <w:br/>
+        <w:t xml:space="preserve">        &lt;tbody&gt;${runs.map(r =&gt; `</w:t>
+        <w:br/>
+        <w:t xml:space="preserve">          &lt;tr style="cursor:pointer;" onclick="loadReportById('${r.run_id}')"&gt;</w:t>
+        <w:br/>
+        <w:t xml:space="preserve">            &lt;td&gt;${r.timestamp}&lt;/td&gt;</w:t>
+        <w:br/>
+        <w:t xml:space="preserve">            &lt;td style="color:var(--text); font-weight:bold;"&gt;${escapeHtml(r.sender || "—")}&lt;/td&gt;</w:t>
+        <w:br/>
+        <w:t xml:space="preserve">            &lt;td style="color:var(--muted);"&gt;${escapeHtml(r.subject || "(no subject)")}&lt;/td&gt;</w:t>
+        <w:br/>
+        <w:t xml:space="preserve">            &lt;td&gt;&lt;span class="badge ${r.verdict}"&gt;${r.verdict?.toUpperCase()}&lt;/span&gt;&lt;/td&gt;</w:t>
+        <w:br/>
+        <w:t xml:space="preserve">            &lt;td&gt;${((r.combined_score||0)*100).toFixed(0)}%&lt;/td&gt;</w:t>
+        <w:br/>
+        <w:t xml:space="preserve">            &lt;td&gt;</w:t>
+        <w:br/>
+        <w:t xml:space="preserve">              &lt;button class="btn btn-primary" style="padding:4px 10px; font-size:0.65rem;" onclick="event.stopPropagation(); loadReportById('${r.run_id}')"&gt;View Report →&lt;/button&gt;</w:t>
+        <w:br/>
+        <w:t xml:space="preserve">            &lt;/td&gt;</w:t>
+        <w:br/>
+        <w:t xml:space="preserve">          &lt;/tr&gt;</w:t>
+        <w:br/>
+        <w:t xml:space="preserve">        `).join("")}&lt;/tbody&gt;</w:t>
+        <w:br/>
+        <w:t xml:space="preserve">      &lt;/table&gt;</w:t>
+        <w:br/>
+        <w:t xml:space="preserve">    `;</w:t>
+        <w:br/>
+        <w:t xml:space="preserve">  } catch (err) {</w:t>
+        <w:br/>
+        <w:t xml:space="preserve">    container.innerHTML = `&lt;div style="color:var(--red); font-size:0.8rem;"&gt;Error loading Gmail feed: ${err.message}&lt;/div&gt;`;</w:t>
+        <w:br/>
+        <w:t xml:space="preserve">  }</w:t>
+        <w:br/>
+        <w:t>}</w:t>
+        <w:br/>
+        <w:br/>
+        <w:t>// ── On load: check URL query params for direct report link ───────────────</w:t>
+        <w:br/>
+        <w:t>window.addEventListener("DOMContentLoaded", () =&gt; {</w:t>
+        <w:br/>
+        <w:t xml:space="preserve">  const urlParams = new URLSearchParams(window.location.search);</w:t>
+        <w:br/>
+        <w:t xml:space="preserve">  const targetId = urlParams.get("run") || urlParams.get("msg");</w:t>
+        <w:br/>
+        <w:t xml:space="preserve">  const tab = urlParams.get("tab");</w:t>
+        <w:br/>
+        <w:t xml:space="preserve">  if (targetId) {</w:t>
+        <w:br/>
+        <w:t xml:space="preserve">    loadReportById(targetId);</w:t>
+        <w:br/>
+        <w:t xml:space="preserve">  } else if (tab) {</w:t>
+        <w:br/>
+        <w:t xml:space="preserve">    switchScreen(tab);</w:t>
+        <w:br/>
+        <w:t xml:space="preserve">  }</w:t>
+        <w:br/>
+        <w:t>});</w:t>
         <w:br/>
         <w:br/>
         <w:t>// ── Footer clock ─────────────────────────────────────────────────────────</w:t>
@@ -8109,6 +8856,1565 @@
         <w:t>echo "Now switch UTM's Network mode for this VM back to 'Host Only',"</w:t>
         <w:br/>
         <w:t>echo "reboot, and confirm 'ping 8.8.8.8' fails before continuing."</w:t>
+        <w:br/>
+      </w:r>
+    </w:p>
+    <w:p/>
+    <w:p>
+      <w:r>
+        <w:rPr>
+          <w:b/>
+          <w:sz w:val="24"/>
+        </w:rPr>
+        <w:t>Module 22</w:t>
+      </w:r>
+    </w:p>
+    <w:p>
+      <w:r>
+        <w:rPr>
+          <w:b/>
+          <w:sz w:val="24"/>
+        </w:rPr>
+        <w:t>gmail_auth.py –</w:t>
+      </w:r>
+    </w:p>
+    <w:p/>
+    <w:p>
+      <w:r>
+        <w:rPr>
+          <w:rFonts w:ascii="Courier New" w:hAnsi="Courier New"/>
+          <w:sz w:val="17"/>
+        </w:rPr>
+        <w:t>"""</w:t>
+        <w:br/>
+        <w:t>gmail_auth.py</w:t>
+        <w:br/>
+        <w:t>Handles OAuth2 authentication with the Gmail API.</w:t>
+        <w:br/>
+        <w:br/>
+        <w:t>On first run: opens a browser window for you to log in and grant permissions.</w:t>
+        <w:br/>
+        <w:t>On subsequent runs: silently reuses the saved token.json.</w:t>
+        <w:br/>
+        <w:br/>
+        <w:t>Scopes requested:</w:t>
+        <w:br/>
+        <w:t xml:space="preserve">    gmail.readonly       — read emails and fetch attachments</w:t>
+        <w:br/>
+        <w:t xml:space="preserve">    gmail.modify         — apply/create labels on messages</w:t>
+        <w:br/>
+        <w:t xml:space="preserve">    gmail.labels         — list and manage labels</w:t>
+        <w:br/>
+        <w:t>"""</w:t>
+        <w:br/>
+        <w:br/>
+        <w:t>import os</w:t>
+        <w:br/>
+        <w:t>import logging</w:t>
+        <w:br/>
+        <w:br/>
+        <w:t>from google.auth.transport.requests import Request</w:t>
+        <w:br/>
+        <w:t>from google.oauth2.credentials import Credentials</w:t>
+        <w:br/>
+        <w:t>from google_auth_oauthlib.flow import InstalledAppFlow</w:t>
+        <w:br/>
+        <w:t>from googleapiclient.discovery import build</w:t>
+        <w:br/>
+        <w:br/>
+        <w:t>log = logging.getLogger(__name__)</w:t>
+        <w:br/>
+        <w:br/>
+        <w:t># The exact scopes PhishTrap needs.</w:t>
+        <w:br/>
+        <w:t># If you change these, delete token.json and re-authorize.</w:t>
+        <w:br/>
+        <w:t>SCOPES = [</w:t>
+        <w:br/>
+        <w:t xml:space="preserve">    "https://www.googleapis.com/auth/gmail.readonly",</w:t>
+        <w:br/>
+        <w:t xml:space="preserve">    "https://www.googleapis.com/auth/gmail.modify",</w:t>
+        <w:br/>
+        <w:t xml:space="preserve">    "https://www.googleapis.com/auth/gmail.labels",</w:t>
+        <w:br/>
+        <w:t>]</w:t>
+        <w:br/>
+        <w:br/>
+        <w:t>CREDENTIALS_FILE = "credentials.json"</w:t>
+        <w:br/>
+        <w:t>TOKEN_FILE = "token.json"</w:t>
+        <w:br/>
+        <w:br/>
+        <w:br/>
+        <w:t>def _load_or_refresh_creds() -&gt; Credentials | None:</w:t>
+        <w:br/>
+        <w:t xml:space="preserve">    """Loads token.json if it exists and refreshes if expired."""</w:t>
+        <w:br/>
+        <w:t xml:space="preserve">    if not os.path.exists(TOKEN_FILE):</w:t>
+        <w:br/>
+        <w:t xml:space="preserve">        return None</w:t>
+        <w:br/>
+        <w:t xml:space="preserve">    creds = Credentials.from_authorized_user_file(TOKEN_FILE, SCOPES)</w:t>
+        <w:br/>
+        <w:t xml:space="preserve">    if creds.valid:</w:t>
+        <w:br/>
+        <w:t xml:space="preserve">        return creds</w:t>
+        <w:br/>
+        <w:t xml:space="preserve">    if creds.expired and creds.refresh_token:</w:t>
+        <w:br/>
+        <w:t xml:space="preserve">        try:</w:t>
+        <w:br/>
+        <w:t xml:space="preserve">            creds.refresh(Request())</w:t>
+        <w:br/>
+        <w:t xml:space="preserve">            _save_token(creds)</w:t>
+        <w:br/>
+        <w:t xml:space="preserve">            return creds</w:t>
+        <w:br/>
+        <w:t xml:space="preserve">        except Exception as e:</w:t>
+        <w:br/>
+        <w:t xml:space="preserve">            log.warning("Token refresh failed: %s — will re-authorize", e)</w:t>
+        <w:br/>
+        <w:t xml:space="preserve">    return None</w:t>
+        <w:br/>
+        <w:br/>
+        <w:br/>
+        <w:t>def _save_token(creds: Credentials) -&gt; None:</w:t>
+        <w:br/>
+        <w:t xml:space="preserve">    with open(TOKEN_FILE, "w") as f:</w:t>
+        <w:br/>
+        <w:t xml:space="preserve">        f.write(creds.to_json())</w:t>
+        <w:br/>
+        <w:t xml:space="preserve">    log.info("Saved token to %s", TOKEN_FILE)</w:t>
+        <w:br/>
+        <w:br/>
+        <w:br/>
+        <w:t>def get_credentials(auth_only: bool = False) -&gt; Credentials:</w:t>
+        <w:br/>
+        <w:t xml:space="preserve">    """</w:t>
+        <w:br/>
+        <w:t xml:space="preserve">    Returns valid OAuth2 credentials. Opens browser if needed.</w:t>
+        <w:br/>
+        <w:t xml:space="preserve">    Set auth_only=True to just do the login flow and exit.</w:t>
+        <w:br/>
+        <w:t xml:space="preserve">    """</w:t>
+        <w:br/>
+        <w:t xml:space="preserve">    if not os.path.exists(CREDENTIALS_FILE):</w:t>
+        <w:br/>
+        <w:t xml:space="preserve">        raise FileNotFoundError(</w:t>
+        <w:br/>
+        <w:t xml:space="preserve">            f"'{CREDENTIALS_FILE}' not found in {os.getcwd()}.\n"</w:t>
+        <w:br/>
+        <w:t xml:space="preserve">            "Download it from Google Cloud Console → APIs &amp; Services → Credentials."</w:t>
+        <w:br/>
+        <w:t xml:space="preserve">        )</w:t>
+        <w:br/>
+        <w:br/>
+        <w:t xml:space="preserve">    creds = _load_or_refresh_creds()</w:t>
+        <w:br/>
+        <w:br/>
+        <w:t xml:space="preserve">    if not creds:</w:t>
+        <w:br/>
+        <w:t xml:space="preserve">        print("\n[gmail_auth] Opening browser for Gmail authorization...")</w:t>
+        <w:br/>
+        <w:t xml:space="preserve">        print("[gmail_auth] Select your Gmail account and click 'Allow'.\n")</w:t>
+        <w:br/>
+        <w:t xml:space="preserve">        flow = InstalledAppFlow.from_client_secrets_file(CREDENTIALS_FILE, SCOPES)</w:t>
+        <w:br/>
+        <w:t xml:space="preserve">        creds = flow.run_local_server(port=0, open_browser=True)</w:t>
+        <w:br/>
+        <w:t xml:space="preserve">        _save_token(creds)</w:t>
+        <w:br/>
+        <w:t xml:space="preserve">        print(f"[gmail_auth] ✅ Authorization successful! Saved to {TOKEN_FILE}\n")</w:t>
+        <w:br/>
+        <w:br/>
+        <w:t xml:space="preserve">    return creds</w:t>
+        <w:br/>
+        <w:br/>
+        <w:br/>
+        <w:t>def build_service():</w:t>
+        <w:br/>
+        <w:t xml:space="preserve">    """Returns an authorized Gmail API service object."""</w:t>
+        <w:br/>
+        <w:t xml:space="preserve">    creds = get_credentials()</w:t>
+        <w:br/>
+        <w:t xml:space="preserve">    service = build("gmail", "v1", credentials=creds)</w:t>
+        <w:br/>
+        <w:t xml:space="preserve">    return service</w:t>
+        <w:br/>
+        <w:br/>
+        <w:br/>
+        <w:t>if __name__ == "__main__":</w:t>
+        <w:br/>
+        <w:t xml:space="preserve">    import sys</w:t>
+        <w:br/>
+        <w:t xml:space="preserve">    logging.basicConfig(level=logging.INFO)</w:t>
+        <w:br/>
+        <w:t xml:space="preserve">    auth_only = "--auth-only" in sys.argv</w:t>
+        <w:br/>
+        <w:t xml:space="preserve">    creds = get_credentials(auth_only=auth_only)</w:t>
+        <w:br/>
+        <w:t xml:space="preserve">    if auth_only:</w:t>
+        <w:br/>
+        <w:t xml:space="preserve">        print("Authorization complete. You can now run: python3 gmail_watcher.py")</w:t>
+        <w:br/>
+        <w:t xml:space="preserve">        sys.exit(0)</w:t>
+        <w:br/>
+        <w:t xml:space="preserve">    svc = build("gmail", "v1", credentials=creds)</w:t>
+        <w:br/>
+        <w:t xml:space="preserve">    profile = svc.users().getProfile(userId="me").execute()</w:t>
+        <w:br/>
+        <w:t xml:space="preserve">    print(f"✅ Authenticated as: {profile.get('emailAddress')}")</w:t>
+        <w:br/>
+        <w:t xml:space="preserve">    print(f"   Total messages: {profile.get('messagesTotal')}")</w:t>
+        <w:br/>
+      </w:r>
+    </w:p>
+    <w:p/>
+    <w:p>
+      <w:r>
+        <w:rPr>
+          <w:b/>
+          <w:sz w:val="24"/>
+        </w:rPr>
+        <w:t>Module 23</w:t>
+      </w:r>
+    </w:p>
+    <w:p>
+      <w:r>
+        <w:rPr>
+          <w:b/>
+          <w:sz w:val="24"/>
+        </w:rPr>
+        <w:t>gmail_labels.py –</w:t>
+      </w:r>
+    </w:p>
+    <w:p/>
+    <w:p>
+      <w:r>
+        <w:rPr>
+          <w:rFonts w:ascii="Courier New" w:hAnsi="Courier New"/>
+          <w:sz w:val="17"/>
+        </w:rPr>
+        <w:t>"""</w:t>
+        <w:br/>
+        <w:t>gmail_labels.py</w:t>
+        <w:br/>
+        <w:t>Creates and manages the PhishTrap label hierarchy in Gmail.</w:t>
+        <w:br/>
+        <w:br/>
+        <w:t>Labels created:</w:t>
+        <w:br/>
+        <w:t xml:space="preserve">    PhishTrap/🔴 Malicious   — verdict=malicious</w:t>
+        <w:br/>
+        <w:t xml:space="preserve">    PhishTrap/🟠 Suspicious  — verdict=suspicious</w:t>
+        <w:br/>
+        <w:t xml:space="preserve">    PhishTrap/✅ Clean        — verdict=benign or low_confidence</w:t>
+        <w:br/>
+        <w:br/>
+        <w:t>Called automatically by gmail_watcher.py on startup.</w:t>
+        <w:br/>
+        <w:t>Safe to run multiple times — won't duplicate existing labels.</w:t>
+        <w:br/>
+        <w:t>"""</w:t>
+        <w:br/>
+        <w:br/>
+        <w:t>import logging</w:t>
+        <w:br/>
+        <w:br/>
+        <w:t>log = logging.getLogger(__name__)</w:t>
+        <w:br/>
+        <w:br/>
+        <w:t># Map from pipeline verdict -&gt; Gmail label name</w:t>
+        <w:br/>
+        <w:t>VERDICT_LABEL_MAP = {</w:t>
+        <w:br/>
+        <w:t xml:space="preserve">    "malicious":       "PhishTrap/🔴 Malicious",</w:t>
+        <w:br/>
+        <w:t xml:space="preserve">    "suspicious":      "PhishTrap/🟠 Suspicious",</w:t>
+        <w:br/>
+        <w:t xml:space="preserve">    "benign":          "PhishTrap/✅ Clean",</w:t>
+        <w:br/>
+        <w:t xml:space="preserve">    "low_confidence":  "PhishTrap/🟠 Suspicious",</w:t>
+        <w:br/>
+        <w:t>}</w:t>
+        <w:br/>
+        <w:br/>
+        <w:t># Background colors for each label (Gmail label color hex codes)</w:t>
+        <w:br/>
+        <w:t>LABEL_COLORS = {</w:t>
+        <w:br/>
+        <w:t xml:space="preserve">    "PhishTrap/🔴 Malicious":  {"backgroundColor": "#cc3a21", "textColor": "#ffffff"},</w:t>
+        <w:br/>
+        <w:t xml:space="preserve">    "PhishTrap/🟠 Suspicious": {"backgroundColor": "#e07218", "textColor": "#ffffff"},</w:t>
+        <w:br/>
+        <w:t xml:space="preserve">    "PhishTrap/✅ Clean":       {"backgroundColor": "#0d804d", "textColor": "#ffffff"},</w:t>
+        <w:br/>
+        <w:t>}</w:t>
+        <w:br/>
+        <w:br/>
+        <w:br/>
+        <w:t>def _get_existing_labels(service) -&gt; dict[str, str]:</w:t>
+        <w:br/>
+        <w:t xml:space="preserve">    """Returns {label_name: label_id} for all existing labels."""</w:t>
+        <w:br/>
+        <w:t xml:space="preserve">    result = service.users().labels().list(userId="me").execute()</w:t>
+        <w:br/>
+        <w:t xml:space="preserve">    return {lbl["name"]: lbl["id"] for lbl in result.get("labels", [])}</w:t>
+        <w:br/>
+        <w:br/>
+        <w:br/>
+        <w:t>def ensure_labels(service) -&gt; dict[str, str]:</w:t>
+        <w:br/>
+        <w:t xml:space="preserve">    """</w:t>
+        <w:br/>
+        <w:t xml:space="preserve">    Creates PhishTrap labels in Gmail if they don't already exist.</w:t>
+        <w:br/>
+        <w:t xml:space="preserve">    Returns {verdict -&gt; label_id} dict used by the watcher to apply labels.</w:t>
+        <w:br/>
+        <w:t xml:space="preserve">    """</w:t>
+        <w:br/>
+        <w:t xml:space="preserve">    existing = _get_existing_labels(service)</w:t>
+        <w:br/>
+        <w:t xml:space="preserve">    verdict_to_id: dict[str, str] = {}</w:t>
+        <w:br/>
+        <w:br/>
+        <w:t xml:space="preserve">    # Build the set of unique label names we need</w:t>
+        <w:br/>
+        <w:t xml:space="preserve">    needed_labels = set(VERDICT_LABEL_MAP.values())</w:t>
+        <w:br/>
+        <w:br/>
+        <w:t xml:space="preserve">    for label_name in needed_labels:</w:t>
+        <w:br/>
+        <w:t xml:space="preserve">        if label_name in existing:</w:t>
+        <w:br/>
+        <w:t xml:space="preserve">            label_id = existing[label_name]</w:t>
+        <w:br/>
+        <w:t xml:space="preserve">            log.info("Label already exists: '%s' (%s)", label_name, label_id)</w:t>
+        <w:br/>
+        <w:t xml:space="preserve">        else:</w:t>
+        <w:br/>
+        <w:t xml:space="preserve">            # Create it</w:t>
+        <w:br/>
+        <w:t xml:space="preserve">            body = {</w:t>
+        <w:br/>
+        <w:t xml:space="preserve">                "name": label_name,</w:t>
+        <w:br/>
+        <w:t xml:space="preserve">                "labelListVisibility": "labelShow",</w:t>
+        <w:br/>
+        <w:t xml:space="preserve">                "messageListVisibility": "show",</w:t>
+        <w:br/>
+        <w:t xml:space="preserve">            }</w:t>
+        <w:br/>
+        <w:t xml:space="preserve">            color = LABEL_COLORS.get(label_name)</w:t>
+        <w:br/>
+        <w:t xml:space="preserve">            if color:</w:t>
+        <w:br/>
+        <w:t xml:space="preserve">                body["color"] = color</w:t>
+        <w:br/>
+        <w:br/>
+        <w:t xml:space="preserve">            try:</w:t>
+        <w:br/>
+        <w:t xml:space="preserve">                created = service.users().labels().create(userId="me", body=body).execute()</w:t>
+        <w:br/>
+        <w:t xml:space="preserve">                label_id = created["id"]</w:t>
+        <w:br/>
+        <w:t xml:space="preserve">                log.info("Created label: '%s' (%s)", label_name, label_id)</w:t>
+        <w:br/>
+        <w:t xml:space="preserve">                print(f"  [labels] Created Gmail label: {label_name}")</w:t>
+        <w:br/>
+        <w:t xml:space="preserve">            except Exception as e:</w:t>
+        <w:br/>
+        <w:t xml:space="preserve">                log.warning("Could not create label '%s': %s", label_name, e)</w:t>
+        <w:br/>
+        <w:t xml:space="preserve">                continue</w:t>
+        <w:br/>
+        <w:br/>
+        <w:t xml:space="preserve">        # Map every verdict string that points to this label</w:t>
+        <w:br/>
+        <w:t xml:space="preserve">        for verdict, target_name in VERDICT_LABEL_MAP.items():</w:t>
+        <w:br/>
+        <w:t xml:space="preserve">            if target_name == label_name:</w:t>
+        <w:br/>
+        <w:t xml:space="preserve">                verdict_to_id[verdict] = label_id</w:t>
+        <w:br/>
+        <w:br/>
+        <w:t xml:space="preserve">    return verdict_to_id</w:t>
+        <w:br/>
+        <w:br/>
+        <w:br/>
+        <w:t>def apply_label(service, message_id: str, label_id: str, all_label_ids: list[str] = None, unspam: bool = True) -&gt; None:</w:t>
+        <w:br/>
+        <w:t xml:space="preserve">    """</w:t>
+        <w:br/>
+        <w:t xml:space="preserve">    Applies a verdict label to a Gmail message, removes conflicting PhishTrap labels,</w:t>
+        <w:br/>
+        <w:t xml:space="preserve">    and if the email is in SPAM, removes the SPAM label so it is visible in Gmail's label views.</w:t>
+        <w:br/>
+        <w:t xml:space="preserve">    """</w:t>
+        <w:br/>
+        <w:t xml:space="preserve">    try:</w:t>
+        <w:br/>
+        <w:t xml:space="preserve">        add_ids = [label_id]</w:t>
+        <w:br/>
+        <w:t xml:space="preserve">        remove_ids = []</w:t>
+        <w:br/>
+        <w:t xml:space="preserve">        if all_label_ids:</w:t>
+        <w:br/>
+        <w:t xml:space="preserve">            remove_ids.extend([lid for lid in all_label_ids if lid != label_id])</w:t>
+        <w:br/>
+        <w:br/>
+        <w:t xml:space="preserve">        if unspam:</w:t>
+        <w:br/>
+        <w:t xml:space="preserve">            # Check if message has SPAM label</w:t>
+        <w:br/>
+        <w:t xml:space="preserve">            meta = service.users().messages().get(userId="me", id=message_id, format="minimal").execute()</w:t>
+        <w:br/>
+        <w:t xml:space="preserve">            if "SPAM" in meta.get("labelIds", []):</w:t>
+        <w:br/>
+        <w:t xml:space="preserve">                remove_ids.append("SPAM")</w:t>
+        <w:br/>
+        <w:t xml:space="preserve">                add_ids.append("INBOX")</w:t>
+        <w:br/>
+        <w:br/>
+        <w:t xml:space="preserve">        body = {"addLabelIds": add_ids}</w:t>
+        <w:br/>
+        <w:t xml:space="preserve">        if remove_ids:</w:t>
+        <w:br/>
+        <w:t xml:space="preserve">            body["removeLabelIds"] = list(set(remove_ids))</w:t>
+        <w:br/>
+        <w:br/>
+        <w:t xml:space="preserve">        service.users().messages().modify(</w:t>
+        <w:br/>
+        <w:t xml:space="preserve">            userId="me",</w:t>
+        <w:br/>
+        <w:t xml:space="preserve">            id=message_id,</w:t>
+        <w:br/>
+        <w:t xml:space="preserve">            body=body,</w:t>
+        <w:br/>
+        <w:t xml:space="preserve">        ).execute()</w:t>
+        <w:br/>
+        <w:t xml:space="preserve">    except Exception as e:</w:t>
+        <w:br/>
+        <w:t xml:space="preserve">        log.warning("Could not apply label %s to message %s: %s", label_id, message_id, e)</w:t>
+        <w:br/>
+        <w:br/>
+        <w:br/>
+        <w:t>if __name__ == "__main__":</w:t>
+        <w:br/>
+        <w:t xml:space="preserve">    # Quick standalone test — just lists existing labels</w:t>
+        <w:br/>
+        <w:t xml:space="preserve">    from gmail_auth import build_service</w:t>
+        <w:br/>
+        <w:t xml:space="preserve">    svc = build_service()</w:t>
+        <w:br/>
+        <w:t xml:space="preserve">    existing = _get_existing_labels(svc)</w:t>
+        <w:br/>
+        <w:t xml:space="preserve">    print("Existing Gmail labels:")</w:t>
+        <w:br/>
+        <w:t xml:space="preserve">    for name, lid in sorted(existing.items()):</w:t>
+        <w:br/>
+        <w:t xml:space="preserve">        print(f"  {lid}  {name}")</w:t>
+        <w:br/>
+      </w:r>
+    </w:p>
+    <w:p/>
+    <w:p>
+      <w:r>
+        <w:rPr>
+          <w:b/>
+          <w:sz w:val="24"/>
+        </w:rPr>
+        <w:t>Module 24</w:t>
+      </w:r>
+    </w:p>
+    <w:p>
+      <w:r>
+        <w:rPr>
+          <w:b/>
+          <w:sz w:val="24"/>
+        </w:rPr>
+        <w:t>gmail_watcher.py –</w:t>
+      </w:r>
+    </w:p>
+    <w:p/>
+    <w:p>
+      <w:r>
+        <w:rPr>
+          <w:rFonts w:ascii="Courier New" w:hAnsi="Courier New"/>
+          <w:sz w:val="17"/>
+        </w:rPr>
+        <w:t>"""</w:t>
+        <w:br/>
+        <w:t>gmail_watcher.py</w:t>
+        <w:br/>
+        <w:t>PhishTrap Gmail Integration — Background Email Monitor</w:t>
+        <w:br/>
+        <w:br/>
+        <w:t>Polls your Gmail Inbox every POLL_INTERVAL_SECONDS for unread messages,</w:t>
+        <w:br/>
+        <w:t>runs each through the full PhishTrap pipeline, and writes a verdict label</w:t>
+        <w:br/>
+        <w:t>back to Gmail.</w:t>
+        <w:br/>
+        <w:br/>
+        <w:t>Usage:</w:t>
+        <w:br/>
+        <w:t xml:space="preserve">    # One-time browser authorization (run this first):</w:t>
+        <w:br/>
+        <w:t xml:space="preserve">    python3 gmail_watcher.py --auth-only</w:t>
+        <w:br/>
+        <w:br/>
+        <w:t xml:space="preserve">    # Start the live watcher:</w:t>
+        <w:br/>
+        <w:t xml:space="preserve">    python3 gmail_watcher.py</w:t>
+        <w:br/>
+        <w:br/>
+        <w:t xml:space="preserve">    # Scan only the last N unread emails (for testing):</w:t>
+        <w:br/>
+        <w:t xml:space="preserve">    python3 gmail_watcher.py --scan-last 5</w:t>
+        <w:br/>
+        <w:br/>
+        <w:t xml:space="preserve">    # Dry run (analyze but don't apply labels):</w:t>
+        <w:br/>
+        <w:t xml:space="preserve">    python3 gmail_watcher.py --dry-run</w:t>
+        <w:br/>
+        <w:br/>
+        <w:t>Safety guarantees:</w:t>
+        <w:br/>
+        <w:t xml:space="preserve">    - Only reads and labels emails — never sends, deletes, or modifies content.</w:t>
+        <w:br/>
+        <w:t xml:space="preserve">    - Detonation is controlled by config.DISABLE_DETONATION (True by default on Mac).</w:t>
+        <w:br/>
+        <w:t xml:space="preserve">    - No payload is ever executed on this machine.</w:t>
+        <w:br/>
+        <w:t>"""</w:t>
+        <w:br/>
+        <w:br/>
+        <w:t>import argparse</w:t>
+        <w:br/>
+        <w:t>import base64</w:t>
+        <w:br/>
+        <w:t>import json</w:t>
+        <w:br/>
+        <w:t>import logging</w:t>
+        <w:br/>
+        <w:t>import os</w:t>
+        <w:br/>
+        <w:t>import sys</w:t>
+        <w:br/>
+        <w:t>import tempfile</w:t>
+        <w:br/>
+        <w:t>import time</w:t>
+        <w:br/>
+        <w:br/>
+        <w:t>from googleapiclient.errors import HttpError</w:t>
+        <w:br/>
+        <w:br/>
+        <w:t># ─── Logging ──────────────────────────────────────────────────────────────────</w:t>
+        <w:br/>
+        <w:t>logging.basicConfig(</w:t>
+        <w:br/>
+        <w:t xml:space="preserve">    level=logging.INFO,</w:t>
+        <w:br/>
+        <w:t xml:space="preserve">    format="%(asctime)s  [%(levelname)s]  %(message)s",</w:t>
+        <w:br/>
+        <w:t xml:space="preserve">    datefmt="%Y-%m-%d %H:%M:%S",</w:t>
+        <w:br/>
+        <w:t>)</w:t>
+        <w:br/>
+        <w:t>log = logging.getLogger(__name__)</w:t>
+        <w:br/>
+        <w:br/>
+        <w:t># ─── Config ───────────────────────────────────────────────────────────────────</w:t>
+        <w:br/>
+        <w:t>POLL_INTERVAL_SECONDS = 15       # check for new mail every 15s for fast response</w:t>
+        <w:br/>
+        <w:t>SEEN_FILE             = "gmail_seen.json"   # tracks already-scanned message IDs</w:t>
+        <w:br/>
+        <w:t>MAX_MESSAGES_PER_POLL = 20       # safety cap per poll cycle</w:t>
+        <w:br/>
+        <w:br/>
+        <w:br/>
+        <w:t># ─── Seen-ID persistence ──────────────────────────────────────────────────────</w:t>
+        <w:br/>
+        <w:t>def _load_seen() -&gt; set[str]:</w:t>
+        <w:br/>
+        <w:t xml:space="preserve">    if os.path.exists(SEEN_FILE):</w:t>
+        <w:br/>
+        <w:t xml:space="preserve">        try:</w:t>
+        <w:br/>
+        <w:t xml:space="preserve">            return set(json.load(open(SEEN_FILE)))</w:t>
+        <w:br/>
+        <w:t xml:space="preserve">        except Exception:</w:t>
+        <w:br/>
+        <w:t xml:space="preserve">            pass</w:t>
+        <w:br/>
+        <w:t xml:space="preserve">    return set()</w:t>
+        <w:br/>
+        <w:br/>
+        <w:br/>
+        <w:t>def _save_seen(seen: set[str]) -&gt; None:</w:t>
+        <w:br/>
+        <w:t xml:space="preserve">    # Keep only the last 5000 IDs to prevent unbounded growth</w:t>
+        <w:br/>
+        <w:t xml:space="preserve">    seen_list = list(seen)[-5000:]</w:t>
+        <w:br/>
+        <w:t xml:space="preserve">    try:</w:t>
+        <w:br/>
+        <w:t xml:space="preserve">        json.dump(seen_list, open(SEEN_FILE, "w"))</w:t>
+        <w:br/>
+        <w:t xml:space="preserve">    except Exception as e:</w:t>
+        <w:br/>
+        <w:t xml:space="preserve">        log.warning("Could not save seen IDs: %s", e)</w:t>
+        <w:br/>
+        <w:br/>
+        <w:br/>
+        <w:t># ─── Gmail helpers ────────────────────────────────────────────────────────────</w:t>
+        <w:br/>
+        <w:t>def _get_recent_message_ids(service, max_results: int = MAX_MESSAGES_PER_POLL) -&gt; list[str]:</w:t>
+        <w:br/>
+        <w:t xml:space="preserve">    """Returns a list of recent Inbox and Spam message IDs, excluding our own bot reports."""</w:t>
+        <w:br/>
+        <w:t xml:space="preserve">    try:</w:t>
+        <w:br/>
+        <w:t xml:space="preserve">        result = service.users().messages().list(</w:t>
+        <w:br/>
+        <w:t xml:space="preserve">            userId="me",</w:t>
+        <w:br/>
+        <w:t xml:space="preserve">            q='(in:inbox OR in:spam) -subject:"[PhishTrap Report]"',</w:t>
+        <w:br/>
+        <w:t xml:space="preserve">            maxResults=max_results,</w:t>
+        <w:br/>
+        <w:t xml:space="preserve">        ).execute()</w:t>
+        <w:br/>
+        <w:t xml:space="preserve">        return [m["id"] for m in result.get("messages", [])]</w:t>
+        <w:br/>
+        <w:t xml:space="preserve">    except Exception as e:</w:t>
+        <w:br/>
+        <w:t xml:space="preserve">        log.error("Failed to list messages: %s", e)</w:t>
+        <w:br/>
+        <w:t xml:space="preserve">        return []</w:t>
+        <w:br/>
+        <w:br/>
+        <w:br/>
+        <w:t>def _get_all_inbox_ids(service, max_results: int) -&gt; list[str]:</w:t>
+        <w:br/>
+        <w:t xml:space="preserve">    """Returns the latest N Inbox and Spam message IDs (for --scan-last mode)."""</w:t>
+        <w:br/>
+        <w:t xml:space="preserve">    return _get_recent_message_ids(service, max_results=max_results)</w:t>
+        <w:br/>
+        <w:br/>
+        <w:br/>
+        <w:t>def _fetch_raw_eml(service, message_id: str) -&gt; bytes | None:</w:t>
+        <w:br/>
+        <w:t xml:space="preserve">    """Downloads the raw RFC-2822 bytes of a Gmail message."""</w:t>
+        <w:br/>
+        <w:t xml:space="preserve">    try:</w:t>
+        <w:br/>
+        <w:t xml:space="preserve">        msg = service.users().messages().get(</w:t>
+        <w:br/>
+        <w:t xml:space="preserve">            userId="me",</w:t>
+        <w:br/>
+        <w:t xml:space="preserve">            id=message_id,</w:t>
+        <w:br/>
+        <w:t xml:space="preserve">            format="raw",</w:t>
+        <w:br/>
+        <w:t xml:space="preserve">        ).execute()</w:t>
+        <w:br/>
+        <w:t xml:space="preserve">        raw = msg.get("raw", "")</w:t>
+        <w:br/>
+        <w:t xml:space="preserve">        return base64.urlsafe_b64decode(raw + "==")   # pad to be safe</w:t>
+        <w:br/>
+        <w:t xml:space="preserve">    except Exception as e:</w:t>
+        <w:br/>
+        <w:t xml:space="preserve">        log.error("Could not fetch message %s: %s", message_id, e)</w:t>
+        <w:br/>
+        <w:t xml:space="preserve">        return None</w:t>
+        <w:br/>
+        <w:br/>
+        <w:br/>
+        <w:t>def _get_snippet(service, message_id: str) -&gt; tuple[str, str]:</w:t>
+        <w:br/>
+        <w:t xml:space="preserve">    """Returns (subject, snippet) from a message metadata fetch."""</w:t>
+        <w:br/>
+        <w:t xml:space="preserve">    try:</w:t>
+        <w:br/>
+        <w:t xml:space="preserve">        msg = service.users().messages().get(</w:t>
+        <w:br/>
+        <w:t xml:space="preserve">            userId="me",</w:t>
+        <w:br/>
+        <w:t xml:space="preserve">            id=message_id,</w:t>
+        <w:br/>
+        <w:t xml:space="preserve">            format="metadata",</w:t>
+        <w:br/>
+        <w:t xml:space="preserve">            metadataHeaders=["Subject", "From"],</w:t>
+        <w:br/>
+        <w:t xml:space="preserve">        ).execute()</w:t>
+        <w:br/>
+        <w:t xml:space="preserve">        headers = {h["name"]: h["value"] for h in msg.get("payload", {}).get("headers", [])}</w:t>
+        <w:br/>
+        <w:t xml:space="preserve">        subject = headers.get("Subject", "(no subject)")</w:t>
+        <w:br/>
+        <w:t xml:space="preserve">        sender = headers.get("From", "unknown")</w:t>
+        <w:br/>
+        <w:t xml:space="preserve">        return sender, subject</w:t>
+        <w:br/>
+        <w:t xml:space="preserve">    except Exception:</w:t>
+        <w:br/>
+        <w:t xml:space="preserve">        return "unknown", "(no subject)"</w:t>
+        <w:br/>
+        <w:br/>
+        <w:br/>
+        <w:t>def _record_scan(run_id: str, message_id: str, report: dict, sender: str, subject: str):</w:t>
+        <w:br/>
+        <w:t xml:space="preserve">    """Saves full report and appends to history.json so web dashboard reflects it."""</w:t>
+        <w:br/>
+        <w:t xml:space="preserve">    os.makedirs("reports", exist_ok=True)</w:t>
+        <w:br/>
+        <w:t xml:space="preserve">    report_copy = dict(report)</w:t>
+        <w:br/>
+        <w:t xml:space="preserve">    report_copy["run_id"] = run_id</w:t>
+        <w:br/>
+        <w:t xml:space="preserve">    report_copy["message_id"] = message_id</w:t>
+        <w:br/>
+        <w:t xml:space="preserve">    report_copy["sender"] = sender</w:t>
+        <w:br/>
+        <w:t xml:space="preserve">    report_copy["subject"] = subject</w:t>
+        <w:br/>
+        <w:t xml:space="preserve">    report_copy["source"] = "gmail"</w:t>
+        <w:br/>
+        <w:br/>
+        <w:t xml:space="preserve">    try:</w:t>
+        <w:br/>
+        <w:t xml:space="preserve">        with open(f"reports/{run_id}.json", "w") as f:</w:t>
+        <w:br/>
+        <w:t xml:space="preserve">            json.dump(report_copy, f, indent=2)</w:t>
+        <w:br/>
+        <w:t xml:space="preserve">        with open(f"reports/msg_{message_id}.json", "w") as f:</w:t>
+        <w:br/>
+        <w:t xml:space="preserve">            json.dump(report_copy, f, indent=2)</w:t>
+        <w:br/>
+        <w:t xml:space="preserve">    except Exception as e:</w:t>
+        <w:br/>
+        <w:t xml:space="preserve">        log.warning("Could not save full report file: %s", e)</w:t>
+        <w:br/>
+        <w:br/>
+        <w:t xml:space="preserve">    history = []</w:t>
+        <w:br/>
+        <w:t xml:space="preserve">    if os.path.exists("history.json"):</w:t>
+        <w:br/>
+        <w:t xml:space="preserve">        try:</w:t>
+        <w:br/>
+        <w:t xml:space="preserve">            history = json.load(open("history.json"))</w:t>
+        <w:br/>
+        <w:t xml:space="preserve">        except Exception:</w:t>
+        <w:br/>
+        <w:t xml:space="preserve">            history = []</w:t>
+        <w:br/>
+        <w:t xml:space="preserve">    history.append({</w:t>
+        <w:br/>
+        <w:t xml:space="preserve">        "run_id": run_id,</w:t>
+        <w:br/>
+        <w:t xml:space="preserve">        "message_id": message_id,</w:t>
+        <w:br/>
+        <w:t xml:space="preserve">        "timestamp": time.strftime("%Y-%m-%d %H:%M:%S"),</w:t>
+        <w:br/>
+        <w:t xml:space="preserve">        "filename": f"gmail_{message_id[:8]}.eml",</w:t>
+        <w:br/>
+        <w:t xml:space="preserve">        "sender": sender,</w:t>
+        <w:br/>
+        <w:t xml:space="preserve">        "subject": subject,</w:t>
+        <w:br/>
+        <w:t xml:space="preserve">        "verdict": report.get("verdict"),</w:t>
+        <w:br/>
+        <w:t xml:space="preserve">        "combined_score": report.get("combined_score"),</w:t>
+        <w:br/>
+        <w:t xml:space="preserve">        "vector_verdicts": report.get("vector_verdicts"),</w:t>
+        <w:br/>
+        <w:t xml:space="preserve">        "source": "gmail",</w:t>
+        <w:br/>
+        <w:t xml:space="preserve">    })</w:t>
+        <w:br/>
+        <w:t xml:space="preserve">    try:</w:t>
+        <w:br/>
+        <w:t xml:space="preserve">        json.dump(history[-50:], open("history.json", "w"), indent=2)</w:t>
+        <w:br/>
+        <w:t xml:space="preserve">    except Exception as e:</w:t>
+        <w:br/>
+        <w:t xml:space="preserve">        log.warning("Could not save history: %s", e)</w:t>
+        <w:br/>
+        <w:br/>
+        <w:br/>
+        <w:t>def _send_thread_report_note(service, message_id: str, report: dict, run_id: str):</w:t>
+        <w:br/>
+        <w:t xml:space="preserve">    """</w:t>
+        <w:br/>
+        <w:t xml:space="preserve">    Sends a private security analysis note directly into the email thread.</w:t>
+        <w:br/>
+        <w:t xml:space="preserve">    Sent from user -&gt; user so only you see it (never sent to the external sender).</w:t>
+        <w:br/>
+        <w:t xml:space="preserve">    Renders as a rich HTML card with a live, 1-click button to the interactive report.</w:t>
+        <w:br/>
+        <w:t xml:space="preserve">    """</w:t>
+        <w:br/>
+        <w:t xml:space="preserve">    try:</w:t>
+        <w:br/>
+        <w:t xml:space="preserve">        msg = service.users().messages().get(</w:t>
+        <w:br/>
+        <w:t xml:space="preserve">            userId="me", id=message_id, format="metadata",</w:t>
+        <w:br/>
+        <w:t xml:space="preserve">            metadataHeaders=["Subject", "Message-ID", "From"]</w:t>
+        <w:br/>
+        <w:t xml:space="preserve">        ).execute()</w:t>
+        <w:br/>
+        <w:t xml:space="preserve">        thread_id = msg.get("threadId", message_id)</w:t>
+        <w:br/>
+        <w:t xml:space="preserve">        headers = {h["name"]: h["value"] for h in msg.get("payload", {}).get("headers", [])}</w:t>
+        <w:br/>
+        <w:t xml:space="preserve">        orig_subject = headers.get("Subject", "(no subject)")</w:t>
+        <w:br/>
+        <w:t xml:space="preserve">        orig_msg_id = headers.get("Message-ID", "")</w:t>
+        <w:br/>
+        <w:br/>
+        <w:t xml:space="preserve">        profile = service.users().getProfile(userId="me").execute()</w:t>
+        <w:br/>
+        <w:t xml:space="preserve">        my_email = profile.get("emailAddress", "me")</w:t>
+        <w:br/>
+        <w:br/>
+        <w:t xml:space="preserve">        verdict = report.get("verdict", "unknown").upper()</w:t>
+        <w:br/>
+        <w:t xml:space="preserve">        verdict_color = {</w:t>
+        <w:br/>
+        <w:t xml:space="preserve">            "MALICIOUS": "#cc3a21",</w:t>
+        <w:br/>
+        <w:t xml:space="preserve">            "SUSPICIOUS": "#e07218",</w:t>
+        <w:br/>
+        <w:t xml:space="preserve">            "BENIGN": "#0d804d",</w:t>
+        <w:br/>
+        <w:t xml:space="preserve">            "LOW_CONFIDENCE": "#e07218",</w:t>
+        <w:br/>
+        <w:t xml:space="preserve">        }.get(verdict, "#58a6ff")</w:t>
+        <w:br/>
+        <w:t xml:space="preserve">        verdict_icon = {</w:t>
+        <w:br/>
+        <w:t xml:space="preserve">            "MALICIOUS": "🔴",</w:t>
+        <w:br/>
+        <w:t xml:space="preserve">            "SUSPICIOUS": "🟠",</w:t>
+        <w:br/>
+        <w:t xml:space="preserve">            "BENIGN": "✅",</w:t>
+        <w:br/>
+        <w:t xml:space="preserve">            "LOW_CONFIDENCE": "⚪",</w:t>
+        <w:br/>
+        <w:t xml:space="preserve">        }.get(verdict, "🔍")</w:t>
+        <w:br/>
+        <w:t xml:space="preserve">        score = int((report.get("combined_score", 0.0)) * 100)</w:t>
+        <w:br/>
+        <w:t xml:space="preserve">        report_url = f"http://127.0.0.1:8080/?run={run_id}"</w:t>
+        <w:br/>
+        <w:br/>
+        <w:t xml:space="preserve">        summary = report.get("plain_english_summary", "Multi-vector security scan finished.")</w:t>
+        <w:br/>
+        <w:br/>
+        <w:t xml:space="preserve">        html_body = f"""&lt;!DOCTYPE html&gt;</w:t>
+        <w:br/>
+        <w:t>&lt;html&gt;</w:t>
+        <w:br/>
+        <w:t>&lt;head&gt;&lt;meta charset="utf-8"&gt;&lt;/head&gt;</w:t>
+        <w:br/>
+        <w:t>&lt;body style="font-family: -apple-system, BlinkMacSystemFont, 'Segoe UI', Roboto, Helvetica, Arial, sans-serif; background:#0d1117; color:#e6edf3; padding:16px; border-radius:8px; margin:8px 0; border: 1px solid #30363d;"&gt;</w:t>
+        <w:br/>
+        <w:t xml:space="preserve">  &lt;div style="font-size:13px; font-weight:bold; color:#8b949e; text-transform:uppercase; letter-spacing:1px; margin-bottom:12px;"&gt;</w:t>
+        <w:br/>
+        <w:t xml:space="preserve">    🛡️ PhishTrap Threat Analysis Report</w:t>
+        <w:br/>
+        <w:t xml:space="preserve">  &lt;/div&gt;</w:t>
+        <w:br/>
+        <w:t xml:space="preserve">  &lt;div style="background:{verdict_color}; color:#ffffff; padding:10px 14px; border-radius:6px; font-weight:bold; font-size:15px; margin-bottom:12px;"&gt;</w:t>
+        <w:br/>
+        <w:t xml:space="preserve">    {verdict_icon} VERDICT: {verdict} &amp;nbsp;&amp;nbsp;|&amp;nbsp;&amp;nbsp; RISK SCORE: {score} / 100</w:t>
+        <w:br/>
+        <w:t xml:space="preserve">  &lt;/div&gt;</w:t>
+        <w:br/>
+        <w:t xml:space="preserve">  &lt;p style="color:#c9d1d9; font-size:13px; line-height:1.5; margin-bottom:16px;"&gt;</w:t>
+        <w:br/>
+        <w:t xml:space="preserve">    &lt;strong&gt;Summary:&lt;/strong&gt; {summary}</w:t>
+        <w:br/>
+        <w:t xml:space="preserve">  &lt;/p&gt;</w:t>
+        <w:br/>
+        <w:t xml:space="preserve">  &lt;div style="margin: 16px 0;"&gt;</w:t>
+        <w:br/>
+        <w:t xml:space="preserve">    &lt;a href="{report_url}" target="_blank" style="background:#238636; color:#ffffff; padding:10px 18px; text-decoration:none; border-radius:6px; font-weight:bold; font-size:13px; display:inline-block;"&gt;</w:t>
+        <w:br/>
+        <w:t xml:space="preserve">      👉 Open Full Interactive Report in Dashboard →</w:t>
+        <w:br/>
+        <w:t xml:space="preserve">    &lt;/a&gt;</w:t>
+        <w:br/>
+        <w:t xml:space="preserve">  &lt;/div&gt;</w:t>
+        <w:br/>
+        <w:t xml:space="preserve">  &lt;div style="font-size:11px; color:#8b949e; border-top:1px solid #21262d; padding-top:8px; margin-top:12px;"&gt;</w:t>
+        <w:br/>
+        <w:t xml:space="preserve">    Report Link: &lt;a href="{report_url}" style="color:#58a6ff;"&gt;{report_url}&lt;/a&gt;&lt;br&gt;</w:t>
+        <w:br/>
+        <w:t xml:space="preserve">    &lt;em&gt;(Private local analysis — visible only in your inbox)&lt;/em&gt;</w:t>
+        <w:br/>
+        <w:t xml:space="preserve">  &lt;/div&gt;</w:t>
+        <w:br/>
+        <w:t>&lt;/body&gt;</w:t>
+        <w:br/>
+        <w:t>&lt;/html&gt;"""</w:t>
+        <w:br/>
+        <w:br/>
+        <w:t xml:space="preserve">        plain_text = f"""🛡️ PhishTrap Threat Analysis Report</w:t>
+        <w:br/>
+        <w:t>Verdict: {verdict_icon} {verdict} (Risk Score: {score}/100)</w:t>
+        <w:br/>
+        <w:t>Summary: {summary}</w:t>
+        <w:br/>
+        <w:br/>
+        <w:t>👉 Open Full Interactive Report:</w:t>
+        <w:br/>
+        <w:t>{report_url}</w:t>
+        <w:br/>
+        <w:t>"""</w:t>
+        <w:br/>
+        <w:br/>
+        <w:t xml:space="preserve">        from email.message import EmailMessage</w:t>
+        <w:br/>
+        <w:t xml:space="preserve">        email_msg = EmailMessage()</w:t>
+        <w:br/>
+        <w:t xml:space="preserve">        email_msg["To"] = my_email</w:t>
+        <w:br/>
+        <w:t xml:space="preserve">        email_msg["From"] = f"PhishTrap Security &lt;{my_email}&gt;"</w:t>
+        <w:br/>
+        <w:t xml:space="preserve">        sub = orig_subject</w:t>
+        <w:br/>
+        <w:t xml:space="preserve">        if not sub.lower().startswith("re:"):</w:t>
+        <w:br/>
+        <w:t xml:space="preserve">            sub = "Re: " + sub</w:t>
+        <w:br/>
+        <w:t xml:space="preserve">        email_msg["Subject"] = f"[PhishTrap Report] {sub}"</w:t>
+        <w:br/>
+        <w:t xml:space="preserve">        if orig_msg_id:</w:t>
+        <w:br/>
+        <w:t xml:space="preserve">            email_msg["In-Reply-To"] = orig_msg_id</w:t>
+        <w:br/>
+        <w:t xml:space="preserve">            email_msg["References"] = orig_msg_id</w:t>
+        <w:br/>
+        <w:t xml:space="preserve">        email_msg.set_content(plain_text)</w:t>
+        <w:br/>
+        <w:t xml:space="preserve">        email_msg.add_alternative(html_body, subtype="html")</w:t>
+        <w:br/>
+        <w:br/>
+        <w:t xml:space="preserve">        raw = base64.urlsafe_b64encode(email_msg.as_bytes()).decode()</w:t>
+        <w:br/>
+        <w:t xml:space="preserve">        sent = service.users().messages().send(</w:t>
+        <w:br/>
+        <w:t xml:space="preserve">            userId="me",</w:t>
+        <w:br/>
+        <w:t xml:space="preserve">            body={"raw": raw, "threadId": thread_id}</w:t>
+        <w:br/>
+        <w:t xml:space="preserve">        ).execute()</w:t>
+        <w:br/>
+        <w:t xml:space="preserve">        log.info("  ✉  Security analysis note sent into thread (ID: %s).", sent.get("id"))</w:t>
+        <w:br/>
+        <w:t xml:space="preserve">    except Exception as e:</w:t>
+        <w:br/>
+        <w:t xml:space="preserve">        log.warning("Could not send thread report note: %s", e)</w:t>
+        <w:br/>
+        <w:br/>
+        <w:br/>
+        <w:t># ─── Core scan loop ───────────────────────────────────────────────────────────</w:t>
+        <w:br/>
+        <w:t>def scan_message(service, message_id: str, verdict_to_label_id: dict,</w:t>
+        <w:br/>
+        <w:t xml:space="preserve">                 dry_run: bool = False) -&gt; dict | None:</w:t>
+        <w:br/>
+        <w:t xml:space="preserve">    """</w:t>
+        <w:br/>
+        <w:t xml:space="preserve">    Downloads, scans, and labels a single Gmail message.</w:t>
+        <w:br/>
+        <w:t xml:space="preserve">    Returns the pipeline report dict, or None on failure.</w:t>
+        <w:br/>
+        <w:t xml:space="preserve">    """</w:t>
+        <w:br/>
+        <w:t xml:space="preserve">    import uuid</w:t>
+        <w:br/>
+        <w:t xml:space="preserve">    from run_pipeline import run_pipeline</w:t>
+        <w:br/>
+        <w:br/>
+        <w:t xml:space="preserve">    sender, subject = _get_snippet(service, message_id)</w:t>
+        <w:br/>
+        <w:t xml:space="preserve">    run_id = f"g_{message_id[:8]}"</w:t>
+        <w:br/>
+        <w:t xml:space="preserve">    log.info("Scanning  [%s]  From: %s  |  Subject: %s", message_id[:8], sender, subject)</w:t>
+        <w:br/>
+        <w:br/>
+        <w:t xml:space="preserve">    # Download raw email bytes</w:t>
+        <w:br/>
+        <w:t xml:space="preserve">    raw_bytes = _fetch_raw_eml(service, message_id)</w:t>
+        <w:br/>
+        <w:t xml:space="preserve">    if not raw_bytes:</w:t>
+        <w:br/>
+        <w:t xml:space="preserve">        log.warning("Could not download message %s — skipping.", message_id)</w:t>
+        <w:br/>
+        <w:t xml:space="preserve">        return None</w:t>
+        <w:br/>
+        <w:br/>
+        <w:t xml:space="preserve">    # Write to a temp .eml file (run_pipeline expects a file path)</w:t>
+        <w:br/>
+        <w:t xml:space="preserve">    with tempfile.NamedTemporaryFile(suffix=".eml", delete=False, dir="uploads") as tmp:</w:t>
+        <w:br/>
+        <w:t xml:space="preserve">        tmp.write(raw_bytes)</w:t>
+        <w:br/>
+        <w:t xml:space="preserve">        tmp_path = tmp.name</w:t>
+        <w:br/>
+        <w:br/>
+        <w:t xml:space="preserve">    try:</w:t>
+        <w:br/>
+        <w:t xml:space="preserve">        def _stage_cb(stage, status, detail=""):</w:t>
+        <w:br/>
+        <w:t xml:space="preserve">            if status not in ("running",):   # only log completions to avoid noise</w:t>
+        <w:br/>
+        <w:t xml:space="preserve">                log.info("    [%s] %s %s", stage, status, f"— {detail}" if detail else "")</w:t>
+        <w:br/>
+        <w:br/>
+        <w:t xml:space="preserve">        report = run_pipeline(tmp_path, on_stage=_stage_cb)</w:t>
+        <w:br/>
+        <w:t xml:space="preserve">    except Exception as e:</w:t>
+        <w:br/>
+        <w:t xml:space="preserve">        log.error("Pipeline error on %s: %s", message_id, e)</w:t>
+        <w:br/>
+        <w:t xml:space="preserve">        return None</w:t>
+        <w:br/>
+        <w:t xml:space="preserve">    finally:</w:t>
+        <w:br/>
+        <w:t xml:space="preserve">        try:</w:t>
+        <w:br/>
+        <w:t xml:space="preserve">            os.unlink(tmp_path)</w:t>
+        <w:br/>
+        <w:t xml:space="preserve">        except Exception:</w:t>
+        <w:br/>
+        <w:t xml:space="preserve">            pass</w:t>
+        <w:br/>
+        <w:br/>
+        <w:t xml:space="preserve">    verdict = report.get("verdict", "low_confidence")</w:t>
+        <w:br/>
+        <w:t xml:space="preserve">    score   = report.get("combined_score", 0.0)</w:t>
+        <w:br/>
+        <w:br/>
+        <w:t xml:space="preserve">    # Pretty log line</w:t>
+        <w:br/>
+        <w:t xml:space="preserve">    verdict_display = {</w:t>
+        <w:br/>
+        <w:t xml:space="preserve">        "malicious":      "🔴 MALICIOUS",</w:t>
+        <w:br/>
+        <w:t xml:space="preserve">        "suspicious":     "🟠 SUSPICIOUS",</w:t>
+        <w:br/>
+        <w:t xml:space="preserve">        "benign":         "✅ CLEAN",</w:t>
+        <w:br/>
+        <w:t xml:space="preserve">        "low_confidence": "⚪ LOW CONFIDENCE",</w:t>
+        <w:br/>
+        <w:t xml:space="preserve">    }.get(verdict, verdict.upper())</w:t>
+        <w:br/>
+        <w:br/>
+        <w:t xml:space="preserve">    log.info("  ➜ Verdict: %s  (score: %.2f)  —  %s", verdict_display, score, subject)</w:t>
+        <w:br/>
+        <w:br/>
+        <w:t xml:space="preserve">    # Apply Gmail label &amp; unspam so it shows under user's sidebar label filters</w:t>
+        <w:br/>
+        <w:t xml:space="preserve">    label_id = verdict_to_label_id.get(verdict)</w:t>
+        <w:br/>
+        <w:t xml:space="preserve">    if label_id and not dry_run:</w:t>
+        <w:br/>
+        <w:t xml:space="preserve">        from gmail_labels import apply_label</w:t>
+        <w:br/>
+        <w:t xml:space="preserve">        apply_label(service, message_id, label_id, list(verdict_to_label_id.values()), unspam=True)</w:t>
+        <w:br/>
+        <w:t xml:space="preserve">        log.info("  ✉  Label applied to message in Gmail (unspammed if in SPAM).")</w:t>
+        <w:br/>
+        <w:t xml:space="preserve">        # Send thread note with clickable HTML report link</w:t>
+        <w:br/>
+        <w:t xml:space="preserve">        _send_thread_report_note(service, message_id, report, run_id)</w:t>
+        <w:br/>
+        <w:t xml:space="preserve">    elif dry_run:</w:t>
+        <w:br/>
+        <w:t xml:space="preserve">        log.info("  [dry-run] Would apply label '%s'", verdict_to_label_id.get(verdict, "none"))</w:t>
+        <w:br/>
+        <w:br/>
+        <w:t xml:space="preserve">    # Record scan in reports/ and history.json</w:t>
+        <w:br/>
+        <w:t xml:space="preserve">    _record_scan(run_id, message_id, report, sender, subject)</w:t>
+        <w:br/>
+        <w:br/>
+        <w:t xml:space="preserve">    return report</w:t>
+        <w:br/>
+        <w:br/>
+        <w:br/>
+        <w:t>def run_watcher(dry_run: bool = False):</w:t>
+        <w:br/>
+        <w:t xml:space="preserve">    """Main poll loop. Runs indefinitely until Ctrl+C."""</w:t>
+        <w:br/>
+        <w:t xml:space="preserve">    from gmail_auth import build_service</w:t>
+        <w:br/>
+        <w:t xml:space="preserve">    from gmail_labels import ensure_labels</w:t>
+        <w:br/>
+        <w:br/>
+        <w:t xml:space="preserve">    log.info("═" * 60)</w:t>
+        <w:br/>
+        <w:t xml:space="preserve">    log.info("  PhishTrap Gmail Watcher starting...")</w:t>
+        <w:br/>
+        <w:t xml:space="preserve">    log.info("  Poll interval : %ds", POLL_INTERVAL_SECONDS)</w:t>
+        <w:br/>
+        <w:t xml:space="preserve">    log.info("  Dry run       : %s", dry_run)</w:t>
+        <w:br/>
+        <w:t xml:space="preserve">    log.info("═" * 60)</w:t>
+        <w:br/>
+        <w:br/>
+        <w:t xml:space="preserve">    service = build_service()</w:t>
+        <w:br/>
+        <w:br/>
+        <w:t xml:space="preserve">    # Get the authenticated user's email address</w:t>
+        <w:br/>
+        <w:t xml:space="preserve">    profile = service.users().getProfile(userId="me").execute()</w:t>
+        <w:br/>
+        <w:t xml:space="preserve">    log.info("Authenticated as: %s", profile.get("emailAddress"))</w:t>
+        <w:br/>
+        <w:br/>
+        <w:t xml:space="preserve">    # Ensure PhishTrap labels exist in Gmail</w:t>
+        <w:br/>
+        <w:t xml:space="preserve">    log.info("Ensuring Gmail labels exist...")</w:t>
+        <w:br/>
+        <w:t xml:space="preserve">    verdict_to_label_id = ensure_labels(service)</w:t>
+        <w:br/>
+        <w:t xml:space="preserve">    label_ids_set = set(verdict_to_label_id.values())</w:t>
+        <w:br/>
+        <w:t xml:space="preserve">    log.info("Labels ready: %s", verdict_to_label_id)</w:t>
+        <w:br/>
+        <w:br/>
+        <w:t xml:space="preserve">    # Load the set of already-scanned message IDs</w:t>
+        <w:br/>
+        <w:t xml:space="preserve">    seen = _load_seen()</w:t>
+        <w:br/>
+        <w:t xml:space="preserve">    log.info("Loaded %d previously seen message IDs.", len(seen))</w:t>
+        <w:br/>
+        <w:br/>
+        <w:t xml:space="preserve">    log.info("Watching Inbox &amp; Spam folders for new emails... (Ctrl+C to stop)\n")</w:t>
+        <w:br/>
+        <w:br/>
+        <w:t xml:space="preserve">    try:</w:t>
+        <w:br/>
+        <w:t xml:space="preserve">        while True:</w:t>
+        <w:br/>
+        <w:t xml:space="preserve">            try:</w:t>
+        <w:br/>
+        <w:t xml:space="preserve">                ids = _get_recent_message_ids(service)</w:t>
+        <w:br/>
+        <w:t xml:space="preserve">                new_ids = [mid for mid in ids if mid not in seen]</w:t>
+        <w:br/>
+        <w:br/>
+        <w:t xml:space="preserve">                to_scan = []</w:t>
+        <w:br/>
+        <w:t xml:space="preserve">                for mid in new_ids:</w:t>
+        <w:br/>
+        <w:t xml:space="preserve">                    try:</w:t>
+        <w:br/>
+        <w:t xml:space="preserve">                        meta = service.users().messages().get(</w:t>
+        <w:br/>
+        <w:t xml:space="preserve">                            userId="me", id=mid, format="minimal"</w:t>
+        <w:br/>
+        <w:t xml:space="preserve">                        ).execute()</w:t>
+        <w:br/>
+        <w:t xml:space="preserve">                        m_labels = set(meta.get("labelIds", []))</w:t>
+        <w:br/>
+        <w:t xml:space="preserve">                        if m_labels.intersection(label_ids_set):</w:t>
+        <w:br/>
+        <w:t xml:space="preserve">                            # Message already has a PhishTrap label</w:t>
+        <w:br/>
+        <w:t xml:space="preserve">                            seen.add(mid)</w:t>
+        <w:br/>
+        <w:t xml:space="preserve">                        else:</w:t>
+        <w:br/>
+        <w:t xml:space="preserve">                            to_scan.append(mid)</w:t>
+        <w:br/>
+        <w:t xml:space="preserve">                    except Exception as e:</w:t>
+        <w:br/>
+        <w:t xml:space="preserve">                        log.warning("Could not check labels for %s: %s", mid, e)</w:t>
+        <w:br/>
+        <w:t xml:space="preserve">                        to_scan.append(mid)</w:t>
+        <w:br/>
+        <w:br/>
+        <w:t xml:space="preserve">                if to_scan:</w:t>
+        <w:br/>
+        <w:t xml:space="preserve">                    log.info("Found %d unscanned message(s) to process.", len(to_scan))</w:t>
+        <w:br/>
+        <w:t xml:space="preserve">                    for mid in to_scan:</w:t>
+        <w:br/>
+        <w:t xml:space="preserve">                        scan_message(service, mid, verdict_to_label_id, dry_run=dry_run)</w:t>
+        <w:br/>
+        <w:t xml:space="preserve">                        seen.add(mid)</w:t>
+        <w:br/>
+        <w:t xml:space="preserve">                        _save_seen(seen)</w:t>
+        <w:br/>
+        <w:t xml:space="preserve">                else:</w:t>
+        <w:br/>
+        <w:t xml:space="preserve">                    log.info("Inbox up to date. Next check in %ds.", POLL_INTERVAL_SECONDS)</w:t>
+        <w:br/>
+        <w:br/>
+        <w:t xml:space="preserve">            except Exception as e:</w:t>
+        <w:br/>
+        <w:t xml:space="preserve">                log.warning("Error during poll cycle: %s. Reconnecting in %ds...", e, POLL_INTERVAL_SECONDS)</w:t>
+        <w:br/>
+        <w:t xml:space="preserve">                try:</w:t>
+        <w:br/>
+        <w:t xml:space="preserve">                    service = build_service()</w:t>
+        <w:br/>
+        <w:t xml:space="preserve">                except Exception as reb_err:</w:t>
+        <w:br/>
+        <w:t xml:space="preserve">                    log.warning("Could not rebuild Gmail service: %s", reb_err)</w:t>
+        <w:br/>
+        <w:br/>
+        <w:t xml:space="preserve">            time.sleep(POLL_INTERVAL_SECONDS)</w:t>
+        <w:br/>
+        <w:br/>
+        <w:t xml:space="preserve">    except KeyboardInterrupt:</w:t>
+        <w:br/>
+        <w:t xml:space="preserve">        log.info("\nWatcher stopped by user.")</w:t>
+        <w:br/>
+        <w:br/>
+        <w:br/>
+        <w:t>def run_scan_last(n: int, dry_run: bool = False):</w:t>
+        <w:br/>
+        <w:t xml:space="preserve">    """Scans the last N messages in Inbox (for testing, ignores seen list)."""</w:t>
+        <w:br/>
+        <w:t xml:space="preserve">    from gmail_auth import build_service</w:t>
+        <w:br/>
+        <w:t xml:space="preserve">    from gmail_labels import ensure_labels</w:t>
+        <w:br/>
+        <w:br/>
+        <w:t xml:space="preserve">    log.info("═" * 60)</w:t>
+        <w:br/>
+        <w:t xml:space="preserve">    log.info("  PhishTrap: scanning last %d inbox messages (test mode)", n)</w:t>
+        <w:br/>
+        <w:t xml:space="preserve">    log.info("═" * 60)</w:t>
+        <w:br/>
+        <w:br/>
+        <w:t xml:space="preserve">    service = build_service()</w:t>
+        <w:br/>
+        <w:t xml:space="preserve">    verdict_to_label_id = ensure_labels(service)</w:t>
+        <w:br/>
+        <w:t xml:space="preserve">    ids = _get_all_inbox_ids(service, max_results=n)</w:t>
+        <w:br/>
+        <w:br/>
+        <w:t xml:space="preserve">    if not ids:</w:t>
+        <w:br/>
+        <w:t xml:space="preserve">        log.info("No messages found.")</w:t>
+        <w:br/>
+        <w:t xml:space="preserve">        return</w:t>
+        <w:br/>
+        <w:br/>
+        <w:t xml:space="preserve">    for mid in ids:</w:t>
+        <w:br/>
+        <w:t xml:space="preserve">        scan_message(service, mid, verdict_to_label_id, dry_run=dry_run)</w:t>
+        <w:br/>
+        <w:br/>
+        <w:t xml:space="preserve">    log.info("Done. Scanned %d message(s).", len(ids))</w:t>
+        <w:br/>
+        <w:br/>
+        <w:br/>
+        <w:t># ─── Entry point ──────────────────────────────────────────────────────────────</w:t>
+        <w:br/>
+        <w:t>if __name__ == "__main__":</w:t>
+        <w:br/>
+        <w:t xml:space="preserve">    parser = argparse.ArgumentParser(description="PhishTrap Gmail Watcher")</w:t>
+        <w:br/>
+        <w:t xml:space="preserve">    parser.add_argument(</w:t>
+        <w:br/>
+        <w:t xml:space="preserve">        "--auth-only", action="store_true",</w:t>
+        <w:br/>
+        <w:t xml:space="preserve">        help="Just do the browser OAuth login flow and exit."</w:t>
+        <w:br/>
+        <w:t xml:space="preserve">    )</w:t>
+        <w:br/>
+        <w:t xml:space="preserve">    parser.add_argument(</w:t>
+        <w:br/>
+        <w:t xml:space="preserve">        "--scan-last", type=int, default=0, metavar="N",</w:t>
+        <w:br/>
+        <w:t xml:space="preserve">        help="Scan the last N inbox messages and exit (for testing)."</w:t>
+        <w:br/>
+        <w:t xml:space="preserve">    )</w:t>
+        <w:br/>
+        <w:t xml:space="preserve">    parser.add_argument(</w:t>
+        <w:br/>
+        <w:t xml:space="preserve">        "--dry-run", action="store_true",</w:t>
+        <w:br/>
+        <w:t xml:space="preserve">        help="Analyze but don't apply labels to Gmail."</w:t>
+        <w:br/>
+        <w:t xml:space="preserve">    )</w:t>
+        <w:br/>
+        <w:t xml:space="preserve">    args = parser.parse_args()</w:t>
+        <w:br/>
+        <w:br/>
+        <w:t xml:space="preserve">    os.makedirs("uploads", exist_ok=True)</w:t>
+        <w:br/>
+        <w:br/>
+        <w:t xml:space="preserve">    if args.auth_only:</w:t>
+        <w:br/>
+        <w:t xml:space="preserve">        from gmail_auth import get_credentials</w:t>
+        <w:br/>
+        <w:t xml:space="preserve">        get_credentials(auth_only=True)</w:t>
+        <w:br/>
+        <w:t xml:space="preserve">        sys.exit(0)</w:t>
+        <w:br/>
+        <w:br/>
+        <w:t xml:space="preserve">    if args.scan_last &gt; 0:</w:t>
+        <w:br/>
+        <w:t xml:space="preserve">        run_scan_last(args.scan_last, dry_run=args.dry_run)</w:t>
+        <w:br/>
+        <w:t xml:space="preserve">    else:</w:t>
+        <w:br/>
+        <w:t xml:space="preserve">        run_watcher(dry_run=args.dry_run)</w:t>
+        <w:br/>
+      </w:r>
+    </w:p>
+    <w:p/>
+    <w:p>
+      <w:r>
+        <w:rPr>
+          <w:b/>
+          <w:sz w:val="24"/>
+        </w:rPr>
+        <w:t>Module 25</w:t>
+      </w:r>
+    </w:p>
+    <w:p>
+      <w:r>
+        <w:rPr>
+          <w:b/>
+          <w:sz w:val="24"/>
+        </w:rPr>
+        <w:t>start_watcher.sh –</w:t>
+      </w:r>
+    </w:p>
+    <w:p/>
+    <w:p>
+      <w:r>
+        <w:rPr>
+          <w:rFonts w:ascii="Courier New" w:hAnsi="Courier New"/>
+          <w:sz w:val="17"/>
+        </w:rPr>
+        <w:t>#!/bin/bash</w:t>
+        <w:br/>
+        <w:t># start_watcher.sh</w:t>
+        <w:br/>
+        <w:t># Starts PhishTrap web dashboard + Gmail watcher in one shot.</w:t>
+        <w:br/>
+        <w:t># Usage: ./start_watcher.sh</w:t>
+        <w:br/>
+        <w:t>#</w:t>
+        <w:br/>
+        <w:t># To stop: press Ctrl+C in each terminal, or `kill $(cat .phishtrap.pids)`</w:t>
+        <w:br/>
+        <w:br/>
+        <w:t>set -e</w:t>
+        <w:br/>
+        <w:t>cd "$(dirname "$0")"   # always run from the PhishTrap directory</w:t>
+        <w:br/>
+        <w:br/>
+        <w:t>echo "╔══════════════════════════════════════╗"</w:t>
+        <w:br/>
+        <w:t>echo "║       PhishTrap — Starting Up        ║"</w:t>
+        <w:br/>
+        <w:t>echo "╚══════════════════════════════════════╝"</w:t>
+        <w:br/>
+        <w:br/>
+        <w:t># ── 1. Check credentials ──────────────────────────────────────────</w:t>
+        <w:br/>
+        <w:t>if [ ! -f "credentials.json" ]; then</w:t>
+        <w:br/>
+        <w:t xml:space="preserve">  echo "❌  credentials.json not found!"</w:t>
+        <w:br/>
+        <w:t xml:space="preserve">  echo "    Download it from Google Cloud Console and place it here."</w:t>
+        <w:br/>
+        <w:t xml:space="preserve">  exit 1</w:t>
+        <w:br/>
+        <w:t>fi</w:t>
+        <w:br/>
+        <w:br/>
+        <w:t>if [ ! -f "token.json" ]; then</w:t>
+        <w:br/>
+        <w:t xml:space="preserve">  echo "⚠️   token.json not found — running one-time browser auth first..."</w:t>
+        <w:br/>
+        <w:t xml:space="preserve">  python3 gmail_watcher.py --auth-only</w:t>
+        <w:br/>
+        <w:t xml:space="preserve">  echo ""</w:t>
+        <w:br/>
+        <w:t>fi</w:t>
+        <w:br/>
+        <w:br/>
+        <w:t># ── 2. Clean up any stale instances &amp; start FastAPI dashboard ─────</w:t>
+        <w:br/>
+        <w:t>if [ -f ".phishtrap.pids" ]; then</w:t>
+        <w:br/>
+        <w:t xml:space="preserve">  kill $(cat .phishtrap.pids) 2&gt;/dev/null || true</w:t>
+        <w:br/>
+        <w:t xml:space="preserve">  rm -f .phishtrap.pids</w:t>
+        <w:br/>
+        <w:t>fi</w:t>
+        <w:br/>
+        <w:t>lsof -ti:8080 | xargs kill -9 2&gt;/dev/null || true</w:t>
+        <w:br/>
+        <w:br/>
+        <w:t>echo "🌐  Starting PhishTrap web dashboard on http://127.0.0.1:8080 ..."</w:t>
+        <w:br/>
+        <w:t>python3 -m uvicorn app:app --host 127.0.0.1 --port 8080 --log-level warning &amp;</w:t>
+        <w:br/>
+        <w:t>UVICORN_PID=$!</w:t>
+        <w:br/>
+        <w:t>echo "    PID: $UVICORN_PID"</w:t>
+        <w:br/>
+        <w:t>sleep 1</w:t>
+        <w:br/>
+        <w:br/>
+        <w:t># ── 3. Start Gmail watcher in background ─────────────────────────</w:t>
+        <w:br/>
+        <w:t>echo "📧  Starting Gmail watcher (polling every 60s)..."</w:t>
+        <w:br/>
+        <w:t>python3 gmail_watcher.py &amp;</w:t>
+        <w:br/>
+        <w:t>WATCHER_PID=$!</w:t>
+        <w:br/>
+        <w:t>echo "    PID: $WATCHER_PID"</w:t>
+        <w:br/>
+        <w:br/>
+        <w:t># ── 4. Save PIDs for easy kill ─────────────────────────────────────</w:t>
+        <w:br/>
+        <w:t>echo "$UVICORN_PID $WATCHER_PID" &gt; .phishtrap.pids</w:t>
+        <w:br/>
+        <w:br/>
+        <w:t>echo ""</w:t>
+        <w:br/>
+        <w:t>echo "══════════════════════════════════════════"</w:t>
+        <w:br/>
+        <w:t>echo "✅  PhishTrap is running!"</w:t>
+        <w:br/>
+        <w:t>echo "    Dashboard : http://127.0.0.1:8080"</w:t>
+        <w:br/>
+        <w:t>echo "    Gmail     : watching Inbox every 60s"</w:t>
+        <w:br/>
+        <w:t>echo ""</w:t>
+        <w:br/>
+        <w:t>echo "    To stop   : kill \$(cat .phishtrap.pids)"</w:t>
+        <w:br/>
+        <w:t>echo "    Or press  : Ctrl+C"</w:t>
+        <w:br/>
+        <w:t>echo "══════════════════════════════════════════"</w:t>
+        <w:br/>
+        <w:br/>
+        <w:t># Keep the script alive so Ctrl+C kills both children</w:t>
+        <w:br/>
+        <w:t>wait $UVICORN_PID $WATCHER_PID</w:t>
+        <w:br/>
+      </w:r>
+    </w:p>
+    <w:p/>
+    <w:p>
+      <w:r>
+        <w:rPr>
+          <w:b/>
+          <w:sz w:val="24"/>
+        </w:rPr>
+        <w:t>Module 26</w:t>
+      </w:r>
+    </w:p>
+    <w:p>
+      <w:r>
+        <w:rPr>
+          <w:b/>
+          <w:sz w:val="24"/>
+        </w:rPr>
+        <w:t>extension/content.js –</w:t>
+      </w:r>
+    </w:p>
+    <w:p/>
+    <w:p>
+      <w:r>
+        <w:rPr>
+          <w:rFonts w:ascii="Courier New" w:hAnsi="Courier New"/>
+          <w:sz w:val="17"/>
+        </w:rPr>
+        <w:t>// PhishTrap Gmail Bridge Content Script</w:t>
+        <w:br/>
+        <w:t>(function () {</w:t>
+        <w:br/>
+        <w:t xml:space="preserve">  const PHISHTRAP_BASE_URL = "http://127.0.0.1:8080";</w:t>
+        <w:br/>
+        <w:br/>
+        <w:t xml:space="preserve">  function injectPhishTrapLinks() {</w:t>
+        <w:br/>
+        <w:t xml:space="preserve">    // 1. Find all label chips matching PhishTrap in email row or email header</w:t>
+        <w:br/>
+        <w:t xml:space="preserve">    const elements = document.querySelectorAll("div[title*='PhishTrap'], span[title*='PhishTrap'], div[aria-label*='PhishTrap']");</w:t>
+        <w:br/>
+        <w:t xml:space="preserve">    elements.forEach((el) =&gt; {</w:t>
+        <w:br/>
+        <w:t xml:space="preserve">      if (el.dataset.phishtrapEnhanced) return;</w:t>
+        <w:br/>
+        <w:t xml:space="preserve">      el.dataset.phishtrapEnhanced = "true";</w:t>
+        <w:br/>
+        <w:t xml:space="preserve">      el.style.cursor = "pointer";</w:t>
+        <w:br/>
+        <w:t xml:space="preserve">      el.title = "Click to open PhishTrap Security Report (opens in new tab)";</w:t>
+        <w:br/>
+        <w:br/>
+        <w:t xml:space="preserve">      el.addEventListener("click", (e) =&gt; {</w:t>
+        <w:br/>
+        <w:t xml:space="preserve">        e.stopPropagation();</w:t>
+        <w:br/>
+        <w:t xml:space="preserve">        window.open(PHISHTRAP_BASE_URL + "/?tab=gmail", "_blank");</w:t>
+        <w:br/>
+        <w:t xml:space="preserve">      });</w:t>
+        <w:br/>
+        <w:t xml:space="preserve">    });</w:t>
+        <w:br/>
+        <w:br/>
+        <w:t xml:space="preserve">    // 2. In open email view, if email has PhishTrap verdict or draft, add quick banner button</w:t>
+        <w:br/>
+        <w:t xml:space="preserve">    const subjectHeaders = document.querySelectorAll("h2[data-thread-perm-id]");</w:t>
+        <w:br/>
+        <w:t xml:space="preserve">    subjectHeaders.forEach((h2) =&gt; {</w:t>
+        <w:br/>
+        <w:t xml:space="preserve">      if (h2.dataset.phishtrapBanner) return;</w:t>
+        <w:br/>
+        <w:t xml:space="preserve">      h2.dataset.phishtrapBanner = "true";</w:t>
+        <w:br/>
+        <w:br/>
+        <w:t xml:space="preserve">      const btn = document.createElement("button");</w:t>
+        <w:br/>
+        <w:t xml:space="preserve">      btn.className = "phishtrap-btn";</w:t>
+        <w:br/>
+        <w:t xml:space="preserve">      btn.innerHTML = "🛡️ PhishTrap Report";</w:t>
+        <w:br/>
+        <w:t xml:space="preserve">      btn.title = "Open PhishTrap Threat Dashboard for this email";</w:t>
+        <w:br/>
+        <w:t xml:space="preserve">      btn.onclick = () =&gt; {</w:t>
+        <w:br/>
+        <w:t xml:space="preserve">        window.open(PHISHTRAP_BASE_URL, "_blank");</w:t>
+        <w:br/>
+        <w:t xml:space="preserve">      };</w:t>
+        <w:br/>
+        <w:br/>
+        <w:t xml:space="preserve">      h2.parentNode.insertBefore(btn, h2.nextSibling);</w:t>
+        <w:br/>
+        <w:t xml:space="preserve">    });</w:t>
+        <w:br/>
+        <w:t xml:space="preserve">  }</w:t>
+        <w:br/>
+        <w:br/>
+        <w:t xml:space="preserve">  // Poll DOM for Gmail's single page app changes</w:t>
+        <w:br/>
+        <w:t xml:space="preserve">  setInterval(injectPhishTrapLinks, 1500);</w:t>
+        <w:br/>
+        <w:t>})();</w:t>
         <w:br/>
       </w:r>
     </w:p>

</xml_diff>